<commit_message>
OOP Assignment - 01 (half)
</commit_message>
<xml_diff>
--- a/2-Semester/OOP/OOP-Assignment-01.docx
+++ b/2-Semester/OOP/OOP-Assignment-01.docx
@@ -4,11 +4,10 @@
   <w:body>
     <w:p>
       <w:pPr>
-        <w:jc w:val="center"/>
         <w:rPr>
           <w:rFonts w:ascii="Bell MT" w:hAnsi="Bell MT"/>
           <w:b/>
-          <w:sz w:val="72"/>
+          <w:sz w:val="52"/>
           <w:szCs w:val="72"/>
           <w:u w:val="single"/>
         </w:rPr>
@@ -22,6 +21,411 @@
           <w:szCs w:val="72"/>
           <w:u w:val="single"/>
         </w:rPr>
+        <w:drawing>
+          <wp:anchor distT="0" distB="0" distL="114300" distR="114300" simplePos="0" relativeHeight="251660288" behindDoc="0" locked="0" layoutInCell="1" allowOverlap="1" wp14:anchorId="1DE8F6FB" wp14:editId="0D57C0DF">
+            <wp:simplePos x="0" y="0"/>
+            <wp:positionH relativeFrom="column">
+              <wp:posOffset>489857</wp:posOffset>
+            </wp:positionH>
+            <wp:positionV relativeFrom="paragraph">
+              <wp:posOffset>454</wp:posOffset>
+            </wp:positionV>
+            <wp:extent cx="5484223" cy="5484223"/>
+            <wp:effectExtent l="0" t="0" r="2540" b="2540"/>
+            <wp:wrapSquare wrapText="bothSides"/>
+            <wp:docPr id="2" name="Picture 2" descr="Sindh Madressatul Islam University"/>
+            <wp:cNvGraphicFramePr>
+              <a:graphicFrameLocks xmlns:a="http://schemas.openxmlformats.org/drawingml/2006/main" noChangeAspect="1"/>
+            </wp:cNvGraphicFramePr>
+            <a:graphic xmlns:a="http://schemas.openxmlformats.org/drawingml/2006/main">
+              <a:graphicData uri="http://schemas.openxmlformats.org/drawingml/2006/picture">
+                <pic:pic xmlns:pic="http://schemas.openxmlformats.org/drawingml/2006/picture">
+                  <pic:nvPicPr>
+                    <pic:cNvPr id="0" name="Picture 1" descr="Sindh Madressatul Islam University"/>
+                    <pic:cNvPicPr>
+                      <a:picLocks noChangeAspect="1" noChangeArrowheads="1"/>
+                    </pic:cNvPicPr>
+                  </pic:nvPicPr>
+                  <pic:blipFill>
+                    <a:blip r:embed="rId5" cstate="print">
+                      <a:extLst>
+                        <a:ext uri="{28A0092B-C50C-407E-A947-70E740481C1C}">
+                          <a14:useLocalDpi xmlns:a14="http://schemas.microsoft.com/office/drawing/2010/main" val="0"/>
+                        </a:ext>
+                      </a:extLst>
+                    </a:blip>
+                    <a:srcRect/>
+                    <a:stretch>
+                      <a:fillRect/>
+                    </a:stretch>
+                  </pic:blipFill>
+                  <pic:spPr bwMode="auto">
+                    <a:xfrm>
+                      <a:off x="0" y="0"/>
+                      <a:ext cx="5484223" cy="5484223"/>
+                    </a:xfrm>
+                    <a:prstGeom prst="rect">
+                      <a:avLst/>
+                    </a:prstGeom>
+                    <a:noFill/>
+                    <a:ln>
+                      <a:noFill/>
+                    </a:ln>
+                  </pic:spPr>
+                </pic:pic>
+              </a:graphicData>
+            </a:graphic>
+            <wp14:sizeRelH relativeFrom="page">
+              <wp14:pctWidth>0</wp14:pctWidth>
+            </wp14:sizeRelH>
+            <wp14:sizeRelV relativeFrom="page">
+              <wp14:pctHeight>0</wp14:pctHeight>
+            </wp14:sizeRelV>
+          </wp:anchor>
+        </w:drawing>
+      </w:r>
+    </w:p>
+    <w:p>
+      <w:pPr>
+        <w:rPr>
+          <w:rFonts w:ascii="Bell MT" w:hAnsi="Bell MT"/>
+          <w:b/>
+          <w:sz w:val="52"/>
+          <w:szCs w:val="72"/>
+          <w:u w:val="single"/>
+        </w:rPr>
+      </w:pPr>
+    </w:p>
+    <w:p>
+      <w:pPr>
+        <w:rPr>
+          <w:rFonts w:ascii="Bell MT" w:hAnsi="Bell MT"/>
+          <w:b/>
+          <w:sz w:val="52"/>
+          <w:szCs w:val="72"/>
+          <w:u w:val="single"/>
+        </w:rPr>
+      </w:pPr>
+    </w:p>
+    <w:p>
+      <w:pPr>
+        <w:rPr>
+          <w:rFonts w:ascii="Bell MT" w:hAnsi="Bell MT"/>
+          <w:b/>
+          <w:sz w:val="52"/>
+          <w:szCs w:val="72"/>
+          <w:u w:val="single"/>
+        </w:rPr>
+      </w:pPr>
+    </w:p>
+    <w:p>
+      <w:pPr>
+        <w:rPr>
+          <w:rFonts w:ascii="Bell MT" w:hAnsi="Bell MT"/>
+          <w:b/>
+          <w:sz w:val="52"/>
+          <w:szCs w:val="72"/>
+          <w:u w:val="single"/>
+        </w:rPr>
+      </w:pPr>
+    </w:p>
+    <w:p>
+      <w:pPr>
+        <w:rPr>
+          <w:rFonts w:ascii="Bell MT" w:hAnsi="Bell MT"/>
+          <w:b/>
+          <w:sz w:val="52"/>
+          <w:szCs w:val="72"/>
+          <w:u w:val="single"/>
+        </w:rPr>
+      </w:pPr>
+    </w:p>
+    <w:p>
+      <w:pPr>
+        <w:rPr>
+          <w:rFonts w:ascii="Bell MT" w:hAnsi="Bell MT"/>
+          <w:b/>
+          <w:sz w:val="52"/>
+          <w:szCs w:val="72"/>
+          <w:u w:val="single"/>
+        </w:rPr>
+      </w:pPr>
+    </w:p>
+    <w:p>
+      <w:pPr>
+        <w:rPr>
+          <w:rFonts w:ascii="Bell MT" w:hAnsi="Bell MT"/>
+          <w:b/>
+          <w:sz w:val="52"/>
+          <w:szCs w:val="72"/>
+          <w:u w:val="single"/>
+        </w:rPr>
+      </w:pPr>
+    </w:p>
+    <w:p>
+      <w:pPr>
+        <w:rPr>
+          <w:rFonts w:ascii="Bell MT" w:hAnsi="Bell MT"/>
+          <w:b/>
+          <w:sz w:val="52"/>
+          <w:szCs w:val="72"/>
+          <w:u w:val="single"/>
+        </w:rPr>
+      </w:pPr>
+    </w:p>
+    <w:p>
+      <w:pPr>
+        <w:rPr>
+          <w:rFonts w:ascii="Bell MT" w:hAnsi="Bell MT"/>
+          <w:b/>
+          <w:sz w:val="52"/>
+          <w:szCs w:val="72"/>
+          <w:u w:val="single"/>
+        </w:rPr>
+      </w:pPr>
+    </w:p>
+    <w:p>
+      <w:pPr>
+        <w:rPr>
+          <w:rFonts w:ascii="Bell MT" w:hAnsi="Bell MT"/>
+          <w:b/>
+          <w:sz w:val="52"/>
+          <w:szCs w:val="72"/>
+          <w:u w:val="single"/>
+        </w:rPr>
+      </w:pPr>
+    </w:p>
+    <w:p>
+      <w:pPr>
+        <w:rPr>
+          <w:rFonts w:ascii="Bell MT" w:hAnsi="Bell MT"/>
+          <w:b/>
+          <w:sz w:val="52"/>
+          <w:szCs w:val="72"/>
+          <w:u w:val="single"/>
+        </w:rPr>
+      </w:pPr>
+      <w:r>
+        <w:rPr>
+          <w:rFonts w:ascii="Bell MT" w:hAnsi="Bell MT"/>
+          <w:b/>
+          <w:sz w:val="52"/>
+          <w:szCs w:val="72"/>
+          <w:u w:val="single"/>
+        </w:rPr>
+        <w:t>Assignment: 01</w:t>
+      </w:r>
+    </w:p>
+    <w:p>
+      <w:pPr>
+        <w:rPr>
+          <w:rFonts w:ascii="Bell MT" w:hAnsi="Bell MT"/>
+          <w:b/>
+          <w:sz w:val="52"/>
+          <w:szCs w:val="72"/>
+          <w:u w:val="single"/>
+        </w:rPr>
+      </w:pPr>
+      <w:r>
+        <w:rPr>
+          <w:rFonts w:ascii="Bell MT" w:hAnsi="Bell MT"/>
+          <w:b/>
+          <w:sz w:val="52"/>
+          <w:szCs w:val="72"/>
+          <w:u w:val="single"/>
+        </w:rPr>
+        <w:t>Name:</w:t>
+      </w:r>
+      <w:r>
+        <w:rPr>
+          <w:rFonts w:ascii="Bell MT" w:hAnsi="Bell MT"/>
+          <w:b/>
+          <w:sz w:val="52"/>
+          <w:szCs w:val="72"/>
+          <w:u w:val="single"/>
+        </w:rPr>
+        <w:t xml:space="preserve"> Tuba Jan</w:t>
+      </w:r>
+    </w:p>
+    <w:p>
+      <w:pPr>
+        <w:rPr>
+          <w:rFonts w:ascii="Bell MT" w:hAnsi="Bell MT"/>
+          <w:b/>
+          <w:sz w:val="52"/>
+          <w:szCs w:val="72"/>
+          <w:u w:val="single"/>
+        </w:rPr>
+      </w:pPr>
+      <w:proofErr w:type="spellStart"/>
+      <w:r>
+        <w:rPr>
+          <w:rFonts w:ascii="Bell MT" w:hAnsi="Bell MT"/>
+          <w:b/>
+          <w:sz w:val="52"/>
+          <w:szCs w:val="72"/>
+          <w:u w:val="single"/>
+        </w:rPr>
+        <w:t>Student_ID</w:t>
+      </w:r>
+      <w:proofErr w:type="spellEnd"/>
+      <w:r>
+        <w:rPr>
+          <w:rFonts w:ascii="Bell MT" w:hAnsi="Bell MT"/>
+          <w:b/>
+          <w:sz w:val="52"/>
+          <w:szCs w:val="72"/>
+          <w:u w:val="single"/>
+        </w:rPr>
+        <w:t>: CSC</w:t>
+      </w:r>
+      <w:r>
+        <w:rPr>
+          <w:rFonts w:ascii="Bell MT" w:hAnsi="Bell MT"/>
+          <w:b/>
+          <w:sz w:val="52"/>
+          <w:szCs w:val="72"/>
+          <w:u w:val="single"/>
+        </w:rPr>
+        <w:t>-25F-603</w:t>
+      </w:r>
+    </w:p>
+    <w:p>
+      <w:pPr>
+        <w:rPr>
+          <w:rFonts w:ascii="Bell MT" w:hAnsi="Bell MT"/>
+          <w:b/>
+          <w:sz w:val="52"/>
+          <w:szCs w:val="72"/>
+          <w:u w:val="single"/>
+        </w:rPr>
+      </w:pPr>
+      <w:r>
+        <w:rPr>
+          <w:rFonts w:ascii="Bell MT" w:hAnsi="Bell MT"/>
+          <w:b/>
+          <w:sz w:val="52"/>
+          <w:szCs w:val="72"/>
+          <w:u w:val="single"/>
+        </w:rPr>
+        <w:t>Subject:</w:t>
+      </w:r>
+      <w:r>
+        <w:rPr>
+          <w:rFonts w:ascii="Bell MT" w:hAnsi="Bell MT"/>
+          <w:b/>
+          <w:sz w:val="52"/>
+          <w:szCs w:val="72"/>
+          <w:u w:val="single"/>
+        </w:rPr>
+        <w:t xml:space="preserve"> Object Oriented Programming</w:t>
+      </w:r>
+    </w:p>
+    <w:p>
+      <w:pPr>
+        <w:rPr>
+          <w:rFonts w:ascii="Bell MT" w:hAnsi="Bell MT"/>
+          <w:b/>
+          <w:sz w:val="52"/>
+          <w:szCs w:val="72"/>
+          <w:u w:val="single"/>
+        </w:rPr>
+      </w:pPr>
+      <w:r>
+        <w:rPr>
+          <w:rFonts w:ascii="Bell MT" w:hAnsi="Bell MT"/>
+          <w:b/>
+          <w:sz w:val="52"/>
+          <w:szCs w:val="72"/>
+          <w:u w:val="single"/>
+        </w:rPr>
+        <w:t xml:space="preserve">Techer </w:t>
+      </w:r>
+      <w:r>
+        <w:rPr>
+          <w:rFonts w:ascii="Bell MT" w:hAnsi="Bell MT"/>
+          <w:b/>
+          <w:sz w:val="52"/>
+          <w:szCs w:val="72"/>
+          <w:u w:val="single"/>
+        </w:rPr>
+        <w:t>Name:</w:t>
+      </w:r>
+      <w:r>
+        <w:rPr>
+          <w:rFonts w:ascii="Bell MT" w:hAnsi="Bell MT"/>
+          <w:b/>
+          <w:sz w:val="52"/>
+          <w:szCs w:val="72"/>
+          <w:u w:val="single"/>
+        </w:rPr>
+        <w:t xml:space="preserve"> Sir </w:t>
+      </w:r>
+      <w:proofErr w:type="spellStart"/>
+      <w:r>
+        <w:rPr>
+          <w:rFonts w:ascii="Bell MT" w:hAnsi="Bell MT"/>
+          <w:b/>
+          <w:sz w:val="52"/>
+          <w:szCs w:val="72"/>
+          <w:u w:val="single"/>
+        </w:rPr>
+        <w:t>Engr</w:t>
+      </w:r>
+      <w:proofErr w:type="spellEnd"/>
+      <w:r>
+        <w:rPr>
+          <w:rFonts w:ascii="Bell MT" w:hAnsi="Bell MT"/>
+          <w:b/>
+          <w:sz w:val="52"/>
+          <w:szCs w:val="72"/>
+          <w:u w:val="single"/>
+        </w:rPr>
+        <w:t xml:space="preserve"> .Majid </w:t>
+      </w:r>
+      <w:proofErr w:type="spellStart"/>
+      <w:r>
+        <w:rPr>
+          <w:rFonts w:ascii="Bell MT" w:hAnsi="Bell MT"/>
+          <w:b/>
+          <w:sz w:val="52"/>
+          <w:szCs w:val="72"/>
+          <w:u w:val="single"/>
+        </w:rPr>
+        <w:t>Kaleem</w:t>
+      </w:r>
+      <w:proofErr w:type="spellEnd"/>
+    </w:p>
+    <w:p>
+      <w:pPr>
+        <w:rPr>
+          <w:rFonts w:ascii="Bell MT" w:hAnsi="Bell MT"/>
+          <w:b/>
+          <w:sz w:val="72"/>
+          <w:szCs w:val="72"/>
+          <w:u w:val="single"/>
+        </w:rPr>
+      </w:pPr>
+      <w:r>
+        <w:rPr>
+          <w:rFonts w:ascii="Bell MT" w:hAnsi="Bell MT"/>
+          <w:b/>
+          <w:sz w:val="72"/>
+          <w:szCs w:val="72"/>
+          <w:u w:val="single"/>
+        </w:rPr>
+        <w:br w:type="page"/>
+      </w:r>
+      <w:r>
+        <w:rPr>
+          <w:rFonts w:ascii="Bell MT" w:hAnsi="Bell MT"/>
+          <w:b/>
+          <w:noProof/>
+          <w:sz w:val="72"/>
+          <w:szCs w:val="72"/>
+          <w:u w:val="single"/>
+        </w:rPr>
+        <w:lastRenderedPageBreak/>
         <w:drawing>
           <wp:anchor distT="0" distB="0" distL="114300" distR="114300" simplePos="0" relativeHeight="251658240" behindDoc="0" locked="0" layoutInCell="1" allowOverlap="1">
             <wp:simplePos x="0" y="0"/>
@@ -141,31 +545,21 @@
       <w:r>
         <w:rPr>
           <w:rFonts w:ascii="Arial" w:eastAsia="Times New Roman" w:hAnsi="Arial" w:cs="Arial"/>
-          <w:color w:val="1F1F1F"/>
-          <w:sz w:val="24"/>
-          <w:szCs w:val="24"/>
-        </w:rPr>
-        <w:t xml:space="preserve">: Define the four pillars of OOP (Abstraction, Encapsulation, Inheritance, </w:t>
-      </w:r>
-      <w:proofErr w:type="gramStart"/>
-      <w:r>
-        <w:rPr>
-          <w:rFonts w:ascii="Arial" w:eastAsia="Times New Roman" w:hAnsi="Arial" w:cs="Arial"/>
-          <w:color w:val="1F1F1F"/>
-          <w:sz w:val="24"/>
-          <w:szCs w:val="24"/>
-        </w:rPr>
-        <w:t>Polymorphism</w:t>
-      </w:r>
-      <w:proofErr w:type="gramEnd"/>
-      <w:r>
-        <w:rPr>
-          <w:rFonts w:ascii="Arial" w:eastAsia="Times New Roman" w:hAnsi="Arial" w:cs="Arial"/>
-          <w:color w:val="1F1F1F"/>
-          <w:sz w:val="24"/>
-          <w:szCs w:val="24"/>
-        </w:rPr>
-        <w:t>) in your own words. Provide one real-world analogy for each.</w:t>
+          <w:b/>
+          <w:color w:val="1F1F1F"/>
+          <w:sz w:val="24"/>
+          <w:szCs w:val="24"/>
+        </w:rPr>
+        <w:t xml:space="preserve"> (a)</w:t>
+      </w:r>
+      <w:r>
+        <w:rPr>
+          <w:rFonts w:ascii="Arial" w:eastAsia="Times New Roman" w:hAnsi="Arial" w:cs="Arial"/>
+          <w:color w:val="1F1F1F"/>
+          <w:sz w:val="24"/>
+          <w:szCs w:val="24"/>
+        </w:rPr>
+        <w:t>: Define the four pillars of OOP (Abstraction, Encapsulation, Inheritance, Polymorphism) in your own words. Provide one real-world analogy for each.</w:t>
       </w:r>
     </w:p>
     <w:p>
@@ -735,6 +1129,7 @@
           <w:sz w:val="24"/>
           <w:szCs w:val="24"/>
         </w:rPr>
+        <w:lastRenderedPageBreak/>
         <w:t>their own unique traits (like a specific talent) that the parent doesn't</w:t>
       </w:r>
       <w:proofErr w:type="gramEnd"/>
@@ -851,7 +1246,6 @@
           <w:sz w:val="24"/>
           <w:szCs w:val="24"/>
         </w:rPr>
-        <w:lastRenderedPageBreak/>
         <w:t>The Concept:</w:t>
       </w:r>
       <w:r>
@@ -991,7 +1385,37 @@
           <w:sz w:val="24"/>
           <w:szCs w:val="24"/>
         </w:rPr>
-        <w:t>Q2</w:t>
+        <w:t>Q-1</w:t>
+      </w:r>
+      <w:r>
+        <w:rPr>
+          <w:rFonts w:ascii="Arial" w:eastAsia="Times New Roman" w:hAnsi="Arial" w:cs="Arial"/>
+          <w:b/>
+          <w:color w:val="1F1F1F"/>
+          <w:sz w:val="24"/>
+          <w:szCs w:val="24"/>
+        </w:rPr>
+        <w:t xml:space="preserve"> (</w:t>
+      </w:r>
+      <w:r>
+        <w:rPr>
+          <w:rFonts w:ascii="Arial" w:eastAsia="Times New Roman" w:hAnsi="Arial" w:cs="Arial"/>
+          <w:b/>
+          <w:color w:val="1F1F1F"/>
+          <w:sz w:val="24"/>
+          <w:szCs w:val="24"/>
+        </w:rPr>
+        <w:t>b</w:t>
+      </w:r>
+      <w:r>
+        <w:rPr>
+          <w:rFonts w:ascii="Arial" w:eastAsia="Times New Roman" w:hAnsi="Arial" w:cs="Arial"/>
+          <w:b/>
+          <w:color w:val="1F1F1F"/>
+          <w:sz w:val="24"/>
+          <w:szCs w:val="24"/>
+        </w:rPr>
+        <w:t>)</w:t>
       </w:r>
       <w:r>
         <w:rPr>
@@ -1060,9 +1484,9 @@
         <w:tblLook w:val="04A0" w:firstRow="1" w:lastRow="0" w:firstColumn="1" w:lastColumn="0" w:noHBand="0" w:noVBand="1"/>
       </w:tblPr>
       <w:tblGrid>
-        <w:gridCol w:w="1897"/>
-        <w:gridCol w:w="2028"/>
-        <w:gridCol w:w="6859"/>
+        <w:gridCol w:w="1749"/>
+        <w:gridCol w:w="1865"/>
+        <w:gridCol w:w="5730"/>
       </w:tblGrid>
       <w:tr>
         <w:trPr>
@@ -1542,6 +1966,7 @@
                 <w:bCs/>
                 <w:sz w:val="22"/>
               </w:rPr>
+              <w:lastRenderedPageBreak/>
               <w:t>private</w:t>
             </w:r>
           </w:p>
@@ -1673,52 +2098,18 @@
       <w:pPr>
         <w:spacing w:before="100" w:beforeAutospacing="1" w:after="100" w:afterAutospacing="1" w:line="240" w:lineRule="auto"/>
         <w:rPr>
-          <w:rFonts w:ascii="Times New Roman" w:eastAsia="Times New Roman" w:hAnsi="Times New Roman" w:cs="Times New Roman"/>
+          <w:rFonts w:ascii="Arial" w:eastAsia="Times New Roman" w:hAnsi="Arial" w:cs="Arial"/>
+          <w:sz w:val="24"/>
+          <w:szCs w:val="24"/>
+        </w:rPr>
+      </w:pPr>
+      <w:r>
+        <w:rPr>
+          <w:rFonts w:ascii="Arial" w:eastAsia="Times New Roman" w:hAnsi="Arial" w:cs="Arial"/>
           <w:b/>
           <w:sz w:val="30"/>
           <w:szCs w:val="24"/>
         </w:rPr>
-      </w:pPr>
-    </w:p>
-    <w:p>
-      <w:pPr>
-        <w:spacing w:before="100" w:beforeAutospacing="1" w:after="100" w:afterAutospacing="1" w:line="240" w:lineRule="auto"/>
-        <w:rPr>
-          <w:rFonts w:ascii="Times New Roman" w:eastAsia="Times New Roman" w:hAnsi="Times New Roman" w:cs="Times New Roman"/>
-          <w:b/>
-          <w:sz w:val="30"/>
-          <w:szCs w:val="24"/>
-        </w:rPr>
-      </w:pPr>
-    </w:p>
-    <w:p>
-      <w:pPr>
-        <w:spacing w:before="100" w:beforeAutospacing="1" w:after="100" w:afterAutospacing="1" w:line="240" w:lineRule="auto"/>
-        <w:rPr>
-          <w:rFonts w:ascii="Times New Roman" w:eastAsia="Times New Roman" w:hAnsi="Times New Roman" w:cs="Times New Roman"/>
-          <w:b/>
-          <w:sz w:val="30"/>
-          <w:szCs w:val="24"/>
-        </w:rPr>
-      </w:pPr>
-    </w:p>
-    <w:p>
-      <w:pPr>
-        <w:spacing w:before="100" w:beforeAutospacing="1" w:after="100" w:afterAutospacing="1" w:line="240" w:lineRule="auto"/>
-        <w:rPr>
-          <w:rFonts w:ascii="Arial" w:eastAsia="Times New Roman" w:hAnsi="Arial" w:cs="Arial"/>
-          <w:sz w:val="24"/>
-          <w:szCs w:val="24"/>
-        </w:rPr>
-      </w:pPr>
-      <w:r>
-        <w:rPr>
-          <w:rFonts w:ascii="Arial" w:eastAsia="Times New Roman" w:hAnsi="Arial" w:cs="Arial"/>
-          <w:b/>
-          <w:sz w:val="30"/>
-          <w:szCs w:val="24"/>
-        </w:rPr>
-        <w:lastRenderedPageBreak/>
         <w:t>2. Encapsulation</w:t>
       </w:r>
       <w:r>
@@ -2066,23 +2457,6 @@
     </w:p>
     <w:p>
       <w:pPr>
-        <w:rPr>
-          <w:rFonts w:ascii="Arial" w:hAnsi="Arial" w:cs="Arial"/>
-          <w:sz w:val="24"/>
-        </w:rPr>
-      </w:pPr>
-      <w:r>
-        <w:rPr>
-          <w:rFonts w:ascii="Arial" w:hAnsi="Arial" w:cs="Arial"/>
-          <w:sz w:val="24"/>
-        </w:rPr>
-        <w:br w:type="page"/>
-      </w:r>
-      <w:bookmarkStart w:id="0" w:name="_GoBack"/>
-      <w:bookmarkEnd w:id="0"/>
-    </w:p>
-    <w:p>
-      <w:pPr>
         <w:spacing w:before="100" w:beforeAutospacing="1" w:after="100" w:afterAutospacing="1" w:line="240" w:lineRule="auto"/>
         <w:rPr>
           <w:rFonts w:ascii="Arial" w:hAnsi="Arial" w:cs="Arial"/>
@@ -2092,22 +2466,54 @@
     </w:p>
     <w:p>
       <w:pPr>
-        <w:rPr>
-          <w:rFonts w:ascii="Arial" w:eastAsia="Times New Roman" w:hAnsi="Arial" w:cs="Arial"/>
-          <w:color w:val="1F1F1F"/>
-          <w:sz w:val="24"/>
-          <w:szCs w:val="24"/>
-        </w:rPr>
-      </w:pPr>
-      <w:r>
-        <w:rPr>
-          <w:rFonts w:ascii="Arial" w:eastAsia="Times New Roman" w:hAnsi="Arial" w:cs="Arial"/>
-          <w:b/>
-          <w:color w:val="1F1F1F"/>
-          <w:sz w:val="24"/>
-          <w:szCs w:val="24"/>
-        </w:rPr>
-        <w:t>Q-2</w:t>
+        <w:spacing w:before="100" w:beforeAutospacing="1" w:after="100" w:afterAutospacing="1" w:line="240" w:lineRule="auto"/>
+        <w:rPr>
+          <w:rFonts w:ascii="Arial" w:eastAsia="Times New Roman" w:hAnsi="Arial" w:cs="Arial"/>
+          <w:color w:val="1F1F1F"/>
+          <w:sz w:val="24"/>
+          <w:szCs w:val="24"/>
+        </w:rPr>
+      </w:pPr>
+      <w:r>
+        <w:rPr>
+          <w:rFonts w:ascii="Arial" w:eastAsia="Times New Roman" w:hAnsi="Arial" w:cs="Arial"/>
+          <w:b/>
+          <w:color w:val="1F1F1F"/>
+          <w:sz w:val="24"/>
+          <w:szCs w:val="24"/>
+        </w:rPr>
+        <w:lastRenderedPageBreak/>
+        <w:t>Q-1</w:t>
+      </w:r>
+      <w:r>
+        <w:rPr>
+          <w:rFonts w:ascii="Arial" w:eastAsia="Times New Roman" w:hAnsi="Arial" w:cs="Arial"/>
+          <w:b/>
+          <w:color w:val="1F1F1F"/>
+          <w:sz w:val="24"/>
+          <w:szCs w:val="24"/>
+        </w:rPr>
+        <w:t xml:space="preserve"> (</w:t>
+      </w:r>
+      <w:r>
+        <w:rPr>
+          <w:rFonts w:ascii="Arial" w:eastAsia="Times New Roman" w:hAnsi="Arial" w:cs="Arial"/>
+          <w:b/>
+          <w:color w:val="1F1F1F"/>
+          <w:sz w:val="24"/>
+          <w:szCs w:val="24"/>
+        </w:rPr>
+        <w:t>c</w:t>
+      </w:r>
+      <w:r>
+        <w:rPr>
+          <w:rFonts w:ascii="Arial" w:eastAsia="Times New Roman" w:hAnsi="Arial" w:cs="Arial"/>
+          <w:b/>
+          <w:color w:val="1F1F1F"/>
+          <w:sz w:val="24"/>
+          <w:szCs w:val="24"/>
+        </w:rPr>
+        <w:t>)</w:t>
       </w:r>
       <w:r>
         <w:rPr>
@@ -2147,9 +2553,9 @@
         <w:tblLook w:val="04A0" w:firstRow="1" w:lastRow="0" w:firstColumn="1" w:lastColumn="0" w:noHBand="0" w:noVBand="1"/>
       </w:tblPr>
       <w:tblGrid>
-        <w:gridCol w:w="1387"/>
-        <w:gridCol w:w="4417"/>
-        <w:gridCol w:w="4980"/>
+        <w:gridCol w:w="1342"/>
+        <w:gridCol w:w="3759"/>
+        <w:gridCol w:w="4243"/>
       </w:tblGrid>
       <w:tr>
         <w:trPr>
@@ -3114,10 +3520,2800 @@
           <w:u w:val="single"/>
         </w:rPr>
       </w:pPr>
+      <w:r>
+        <w:rPr>
+          <w:rFonts w:ascii="Bell MT" w:hAnsi="Bell MT"/>
+          <w:b/>
+          <w:sz w:val="52"/>
+          <w:szCs w:val="40"/>
+          <w:u w:val="single"/>
+        </w:rPr>
+        <w:br w:type="page"/>
+      </w:r>
+    </w:p>
+    <w:p>
+      <w:pPr>
+        <w:rPr>
+          <w:rFonts w:ascii="Arial" w:eastAsia="Times New Roman" w:hAnsi="Arial" w:cs="Arial"/>
+          <w:b/>
+          <w:color w:val="1F1F1F"/>
+          <w:sz w:val="24"/>
+          <w:szCs w:val="24"/>
+        </w:rPr>
+      </w:pPr>
+      <w:r>
+        <w:rPr>
+          <w:rFonts w:ascii="Arial" w:eastAsia="Times New Roman" w:hAnsi="Arial" w:cs="Arial"/>
+          <w:b/>
+          <w:color w:val="1F1F1F"/>
+          <w:sz w:val="24"/>
+          <w:szCs w:val="24"/>
+        </w:rPr>
+        <w:lastRenderedPageBreak/>
+        <w:t>Q-</w:t>
+      </w:r>
+      <w:proofErr w:type="gramStart"/>
+      <w:r>
+        <w:rPr>
+          <w:rFonts w:ascii="Arial" w:eastAsia="Times New Roman" w:hAnsi="Arial" w:cs="Arial"/>
+          <w:b/>
+          <w:color w:val="1F1F1F"/>
+          <w:sz w:val="24"/>
+          <w:szCs w:val="24"/>
+        </w:rPr>
+        <w:t>2</w:t>
+      </w:r>
+      <w:r>
+        <w:rPr>
+          <w:rFonts w:ascii="Arial" w:eastAsia="Times New Roman" w:hAnsi="Arial" w:cs="Arial"/>
+          <w:b/>
+          <w:color w:val="1F1F1F"/>
+          <w:sz w:val="24"/>
+          <w:szCs w:val="24"/>
+        </w:rPr>
+        <w:t xml:space="preserve"> :</w:t>
+      </w:r>
+      <w:proofErr w:type="gramEnd"/>
+      <w:r>
+        <w:rPr>
+          <w:rFonts w:ascii="Arial" w:eastAsia="Times New Roman" w:hAnsi="Arial" w:cs="Arial"/>
+          <w:b/>
+          <w:color w:val="1F1F1F"/>
+          <w:sz w:val="24"/>
+          <w:szCs w:val="24"/>
+        </w:rPr>
+        <w:t xml:space="preserve"> </w:t>
+      </w:r>
+      <w:r>
+        <w:t xml:space="preserve">You are designing a simple University Management System. </w:t>
+      </w:r>
+      <w:r>
+        <w:t>The system</w:t>
+      </w:r>
+      <w:r>
+        <w:t xml:space="preserve"> should manage Students and Courses.</w:t>
+      </w:r>
+    </w:p>
+    <w:p>
+      <w:pPr>
+        <w:rPr>
+          <w:sz w:val="26"/>
+        </w:rPr>
+      </w:pPr>
+      <w:r>
+        <w:rPr>
+          <w:rFonts w:ascii="Arial" w:eastAsia="Times New Roman" w:hAnsi="Arial" w:cs="Arial"/>
+          <w:b/>
+          <w:color w:val="1F1F1F"/>
+          <w:sz w:val="28"/>
+          <w:szCs w:val="24"/>
+        </w:rPr>
+        <w:t>(a)</w:t>
+      </w:r>
+      <w:r>
+        <w:rPr>
+          <w:rFonts w:ascii="Arial" w:eastAsia="Times New Roman" w:hAnsi="Arial" w:cs="Arial"/>
+          <w:color w:val="1F1F1F"/>
+          <w:sz w:val="28"/>
+          <w:szCs w:val="24"/>
+        </w:rPr>
+        <w:t>:</w:t>
+      </w:r>
+      <w:r>
+        <w:rPr>
+          <w:sz w:val="26"/>
+        </w:rPr>
+        <w:t xml:space="preserve"> </w:t>
+      </w:r>
+      <w:r>
+        <w:rPr>
+          <w:sz w:val="26"/>
+        </w:rPr>
+        <w:t>Create a base class Person with attributes name and age</w:t>
+      </w:r>
+      <w:r>
+        <w:rPr>
+          <w:sz w:val="26"/>
+        </w:rPr>
+        <w:t>.</w:t>
+      </w:r>
+    </w:p>
+    <w:p>
+      <w:pPr>
+        <w:spacing w:after="0"/>
+        <w:rPr>
+          <w:rFonts w:ascii="Arial" w:hAnsi="Arial" w:cs="Arial"/>
+          <w:sz w:val="20"/>
+          <w:szCs w:val="24"/>
+        </w:rPr>
+      </w:pPr>
+      <w:proofErr w:type="gramStart"/>
+      <w:r>
+        <w:rPr>
+          <w:rFonts w:ascii="Arial" w:hAnsi="Arial" w:cs="Arial"/>
+          <w:sz w:val="20"/>
+          <w:szCs w:val="24"/>
+        </w:rPr>
+        <w:t>class</w:t>
+      </w:r>
+      <w:proofErr w:type="gramEnd"/>
+      <w:r>
+        <w:rPr>
+          <w:rFonts w:ascii="Arial" w:hAnsi="Arial" w:cs="Arial"/>
+          <w:sz w:val="20"/>
+          <w:szCs w:val="24"/>
+        </w:rPr>
+        <w:t xml:space="preserve"> Person {</w:t>
+      </w:r>
+    </w:p>
+    <w:p>
+      <w:pPr>
+        <w:spacing w:after="0"/>
+        <w:rPr>
+          <w:rFonts w:ascii="Arial" w:hAnsi="Arial" w:cs="Arial"/>
+          <w:sz w:val="20"/>
+          <w:szCs w:val="24"/>
+        </w:rPr>
+      </w:pPr>
+      <w:r>
+        <w:rPr>
+          <w:rFonts w:ascii="Arial" w:hAnsi="Arial" w:cs="Arial"/>
+          <w:sz w:val="20"/>
+          <w:szCs w:val="24"/>
+        </w:rPr>
+        <w:t xml:space="preserve">    </w:t>
+      </w:r>
+      <w:proofErr w:type="gramStart"/>
+      <w:r>
+        <w:rPr>
+          <w:rFonts w:ascii="Arial" w:hAnsi="Arial" w:cs="Arial"/>
+          <w:sz w:val="20"/>
+          <w:szCs w:val="24"/>
+        </w:rPr>
+        <w:t>name</w:t>
+      </w:r>
+      <w:proofErr w:type="gramEnd"/>
+      <w:r>
+        <w:rPr>
+          <w:rFonts w:ascii="Arial" w:hAnsi="Arial" w:cs="Arial"/>
+          <w:sz w:val="20"/>
+          <w:szCs w:val="24"/>
+        </w:rPr>
+        <w:t>: string;</w:t>
+      </w:r>
+    </w:p>
+    <w:p>
+      <w:pPr>
+        <w:spacing w:after="0"/>
+        <w:rPr>
+          <w:rFonts w:ascii="Arial" w:hAnsi="Arial" w:cs="Arial"/>
+          <w:sz w:val="20"/>
+          <w:szCs w:val="24"/>
+        </w:rPr>
+      </w:pPr>
+      <w:r>
+        <w:rPr>
+          <w:rFonts w:ascii="Arial" w:hAnsi="Arial" w:cs="Arial"/>
+          <w:sz w:val="20"/>
+          <w:szCs w:val="24"/>
+        </w:rPr>
+        <w:t xml:space="preserve">    </w:t>
+      </w:r>
+      <w:proofErr w:type="gramStart"/>
+      <w:r>
+        <w:rPr>
+          <w:rFonts w:ascii="Arial" w:hAnsi="Arial" w:cs="Arial"/>
+          <w:sz w:val="20"/>
+          <w:szCs w:val="24"/>
+        </w:rPr>
+        <w:t>age</w:t>
+      </w:r>
+      <w:proofErr w:type="gramEnd"/>
+      <w:r>
+        <w:rPr>
+          <w:rFonts w:ascii="Arial" w:hAnsi="Arial" w:cs="Arial"/>
+          <w:sz w:val="20"/>
+          <w:szCs w:val="24"/>
+        </w:rPr>
+        <w:t>: number;</w:t>
+      </w:r>
+    </w:p>
+    <w:p>
+      <w:pPr>
+        <w:spacing w:after="0"/>
+        <w:rPr>
+          <w:rFonts w:ascii="Arial" w:hAnsi="Arial" w:cs="Arial"/>
+          <w:sz w:val="20"/>
+          <w:szCs w:val="24"/>
+        </w:rPr>
+      </w:pPr>
+    </w:p>
+    <w:p>
+      <w:pPr>
+        <w:spacing w:after="0"/>
+        <w:rPr>
+          <w:rFonts w:ascii="Arial" w:hAnsi="Arial" w:cs="Arial"/>
+          <w:sz w:val="20"/>
+          <w:szCs w:val="24"/>
+        </w:rPr>
+      </w:pPr>
+      <w:r>
+        <w:rPr>
+          <w:rFonts w:ascii="Arial" w:hAnsi="Arial" w:cs="Arial"/>
+          <w:sz w:val="20"/>
+          <w:szCs w:val="24"/>
+        </w:rPr>
+        <w:t xml:space="preserve">    </w:t>
+      </w:r>
+      <w:proofErr w:type="gramStart"/>
+      <w:r>
+        <w:rPr>
+          <w:rFonts w:ascii="Arial" w:hAnsi="Arial" w:cs="Arial"/>
+          <w:sz w:val="20"/>
+          <w:szCs w:val="24"/>
+        </w:rPr>
+        <w:t>constructor(</w:t>
+      </w:r>
+      <w:proofErr w:type="gramEnd"/>
+      <w:r>
+        <w:rPr>
+          <w:rFonts w:ascii="Arial" w:hAnsi="Arial" w:cs="Arial"/>
+          <w:sz w:val="20"/>
+          <w:szCs w:val="24"/>
+        </w:rPr>
+        <w:t>name: string, age: number) {</w:t>
+      </w:r>
+    </w:p>
+    <w:p>
+      <w:pPr>
+        <w:spacing w:after="0"/>
+        <w:rPr>
+          <w:rFonts w:ascii="Arial" w:hAnsi="Arial" w:cs="Arial"/>
+          <w:sz w:val="20"/>
+          <w:szCs w:val="24"/>
+        </w:rPr>
+      </w:pPr>
+      <w:r>
+        <w:rPr>
+          <w:rFonts w:ascii="Arial" w:hAnsi="Arial" w:cs="Arial"/>
+          <w:sz w:val="20"/>
+          <w:szCs w:val="24"/>
+        </w:rPr>
+        <w:t xml:space="preserve">        this.name = name;</w:t>
+      </w:r>
+    </w:p>
+    <w:p>
+      <w:pPr>
+        <w:spacing w:after="0"/>
+        <w:rPr>
+          <w:rFonts w:ascii="Arial" w:hAnsi="Arial" w:cs="Arial"/>
+          <w:sz w:val="20"/>
+          <w:szCs w:val="24"/>
+        </w:rPr>
+      </w:pPr>
+      <w:r>
+        <w:rPr>
+          <w:rFonts w:ascii="Arial" w:hAnsi="Arial" w:cs="Arial"/>
+          <w:sz w:val="20"/>
+          <w:szCs w:val="24"/>
+        </w:rPr>
+        <w:t xml:space="preserve">        </w:t>
+      </w:r>
+      <w:proofErr w:type="spellStart"/>
+      <w:r>
+        <w:rPr>
+          <w:rFonts w:ascii="Arial" w:hAnsi="Arial" w:cs="Arial"/>
+          <w:sz w:val="20"/>
+          <w:szCs w:val="24"/>
+        </w:rPr>
+        <w:t>this.age</w:t>
+      </w:r>
+      <w:proofErr w:type="spellEnd"/>
+      <w:r>
+        <w:rPr>
+          <w:rFonts w:ascii="Arial" w:hAnsi="Arial" w:cs="Arial"/>
+          <w:sz w:val="20"/>
+          <w:szCs w:val="24"/>
+        </w:rPr>
+        <w:t xml:space="preserve"> = age;</w:t>
+      </w:r>
+    </w:p>
+    <w:p>
+      <w:pPr>
+        <w:spacing w:after="0"/>
+        <w:rPr>
+          <w:rFonts w:ascii="Arial" w:hAnsi="Arial" w:cs="Arial"/>
+          <w:sz w:val="20"/>
+          <w:szCs w:val="24"/>
+        </w:rPr>
+      </w:pPr>
+      <w:r>
+        <w:rPr>
+          <w:rFonts w:ascii="Arial" w:hAnsi="Arial" w:cs="Arial"/>
+          <w:sz w:val="20"/>
+          <w:szCs w:val="24"/>
+        </w:rPr>
+        <w:t xml:space="preserve">    }</w:t>
+      </w:r>
+    </w:p>
+    <w:p>
+      <w:pPr>
+        <w:spacing w:after="0"/>
+        <w:rPr>
+          <w:rFonts w:ascii="Arial" w:hAnsi="Arial" w:cs="Arial"/>
+          <w:sz w:val="20"/>
+          <w:szCs w:val="24"/>
+        </w:rPr>
+      </w:pPr>
+      <w:r>
+        <w:rPr>
+          <w:rFonts w:ascii="Arial" w:hAnsi="Arial" w:cs="Arial"/>
+          <w:sz w:val="20"/>
+          <w:szCs w:val="24"/>
+        </w:rPr>
+        <w:t>}</w:t>
+      </w:r>
+    </w:p>
+    <w:p>
+      <w:pPr>
+        <w:spacing w:after="0"/>
+        <w:rPr>
+          <w:rFonts w:ascii="Arial" w:hAnsi="Arial" w:cs="Arial"/>
+          <w:sz w:val="20"/>
+          <w:szCs w:val="24"/>
+        </w:rPr>
+      </w:pPr>
+    </w:p>
+    <w:p>
+      <w:pPr>
+        <w:spacing w:after="0"/>
+        <w:rPr>
+          <w:sz w:val="26"/>
+        </w:rPr>
+      </w:pPr>
+      <w:r>
+        <w:rPr>
+          <w:rFonts w:ascii="Arial" w:eastAsia="Times New Roman" w:hAnsi="Arial" w:cs="Arial"/>
+          <w:b/>
+          <w:color w:val="1F1F1F"/>
+          <w:sz w:val="28"/>
+          <w:szCs w:val="24"/>
+        </w:rPr>
+        <w:t>(</w:t>
+      </w:r>
+      <w:r>
+        <w:rPr>
+          <w:rFonts w:ascii="Arial" w:eastAsia="Times New Roman" w:hAnsi="Arial" w:cs="Arial"/>
+          <w:b/>
+          <w:color w:val="1F1F1F"/>
+          <w:sz w:val="28"/>
+          <w:szCs w:val="24"/>
+        </w:rPr>
+        <w:t>b</w:t>
+      </w:r>
+      <w:r>
+        <w:rPr>
+          <w:rFonts w:ascii="Arial" w:eastAsia="Times New Roman" w:hAnsi="Arial" w:cs="Arial"/>
+          <w:b/>
+          <w:color w:val="1F1F1F"/>
+          <w:sz w:val="28"/>
+          <w:szCs w:val="24"/>
+        </w:rPr>
+        <w:t>)</w:t>
+      </w:r>
+      <w:r>
+        <w:rPr>
+          <w:rFonts w:ascii="Arial" w:eastAsia="Times New Roman" w:hAnsi="Arial" w:cs="Arial"/>
+          <w:color w:val="1F1F1F"/>
+          <w:sz w:val="28"/>
+          <w:szCs w:val="24"/>
+        </w:rPr>
+        <w:t>:</w:t>
+      </w:r>
+      <w:r>
+        <w:rPr>
+          <w:sz w:val="26"/>
+        </w:rPr>
+        <w:t xml:space="preserve"> Use appropriate access modifiers for attributes.</w:t>
+      </w:r>
+      <w:r>
+        <w:rPr>
+          <w:sz w:val="26"/>
+        </w:rPr>
+        <w:t xml:space="preserve">  </w:t>
+      </w:r>
+    </w:p>
+    <w:p>
+      <w:pPr>
+        <w:spacing w:after="0"/>
+        <w:rPr>
+          <w:sz w:val="26"/>
+        </w:rPr>
+      </w:pPr>
+    </w:p>
+    <w:p>
+      <w:pPr>
+        <w:spacing w:after="0"/>
+        <w:rPr>
+          <w:rFonts w:ascii="Arial" w:hAnsi="Arial" w:cs="Arial"/>
+          <w:sz w:val="20"/>
+          <w:szCs w:val="24"/>
+        </w:rPr>
+      </w:pPr>
+      <w:proofErr w:type="gramStart"/>
+      <w:r>
+        <w:rPr>
+          <w:rFonts w:ascii="Arial" w:hAnsi="Arial" w:cs="Arial"/>
+          <w:sz w:val="20"/>
+          <w:szCs w:val="24"/>
+        </w:rPr>
+        <w:t>class</w:t>
+      </w:r>
+      <w:proofErr w:type="gramEnd"/>
+      <w:r>
+        <w:rPr>
+          <w:rFonts w:ascii="Arial" w:hAnsi="Arial" w:cs="Arial"/>
+          <w:sz w:val="20"/>
+          <w:szCs w:val="24"/>
+        </w:rPr>
+        <w:t xml:space="preserve"> Person {</w:t>
+      </w:r>
+    </w:p>
+    <w:p>
+      <w:pPr>
+        <w:spacing w:after="0"/>
+        <w:rPr>
+          <w:rFonts w:ascii="Arial" w:hAnsi="Arial" w:cs="Arial"/>
+          <w:sz w:val="20"/>
+          <w:szCs w:val="24"/>
+        </w:rPr>
+      </w:pPr>
+      <w:r>
+        <w:rPr>
+          <w:rFonts w:ascii="Arial" w:hAnsi="Arial" w:cs="Arial"/>
+          <w:sz w:val="20"/>
+          <w:szCs w:val="24"/>
+        </w:rPr>
+        <w:t xml:space="preserve">    </w:t>
+      </w:r>
+      <w:proofErr w:type="gramStart"/>
+      <w:r>
+        <w:rPr>
+          <w:rFonts w:ascii="Arial" w:hAnsi="Arial" w:cs="Arial"/>
+          <w:sz w:val="20"/>
+          <w:szCs w:val="24"/>
+        </w:rPr>
+        <w:t>public</w:t>
+      </w:r>
+      <w:proofErr w:type="gramEnd"/>
+      <w:r>
+        <w:rPr>
+          <w:rFonts w:ascii="Arial" w:hAnsi="Arial" w:cs="Arial"/>
+          <w:sz w:val="20"/>
+          <w:szCs w:val="24"/>
+        </w:rPr>
+        <w:t xml:space="preserve"> name: string;</w:t>
+      </w:r>
+    </w:p>
+    <w:p>
+      <w:pPr>
+        <w:spacing w:after="0"/>
+        <w:rPr>
+          <w:rFonts w:ascii="Arial" w:hAnsi="Arial" w:cs="Arial"/>
+          <w:sz w:val="20"/>
+          <w:szCs w:val="24"/>
+        </w:rPr>
+      </w:pPr>
+      <w:r>
+        <w:rPr>
+          <w:rFonts w:ascii="Arial" w:hAnsi="Arial" w:cs="Arial"/>
+          <w:sz w:val="20"/>
+          <w:szCs w:val="24"/>
+        </w:rPr>
+        <w:t xml:space="preserve">    </w:t>
+      </w:r>
+      <w:proofErr w:type="gramStart"/>
+      <w:r>
+        <w:rPr>
+          <w:rFonts w:ascii="Arial" w:hAnsi="Arial" w:cs="Arial"/>
+          <w:sz w:val="20"/>
+          <w:szCs w:val="24"/>
+        </w:rPr>
+        <w:t>private</w:t>
+      </w:r>
+      <w:proofErr w:type="gramEnd"/>
+      <w:r>
+        <w:rPr>
+          <w:rFonts w:ascii="Arial" w:hAnsi="Arial" w:cs="Arial"/>
+          <w:sz w:val="20"/>
+          <w:szCs w:val="24"/>
+        </w:rPr>
+        <w:t xml:space="preserve"> age: number;</w:t>
+      </w:r>
+    </w:p>
+    <w:p>
+      <w:pPr>
+        <w:spacing w:after="0"/>
+        <w:rPr>
+          <w:rFonts w:ascii="Arial" w:hAnsi="Arial" w:cs="Arial"/>
+          <w:sz w:val="20"/>
+          <w:szCs w:val="24"/>
+        </w:rPr>
+      </w:pPr>
+    </w:p>
+    <w:p>
+      <w:pPr>
+        <w:spacing w:after="0"/>
+        <w:rPr>
+          <w:rFonts w:ascii="Arial" w:hAnsi="Arial" w:cs="Arial"/>
+          <w:sz w:val="20"/>
+          <w:szCs w:val="24"/>
+        </w:rPr>
+      </w:pPr>
+      <w:r>
+        <w:rPr>
+          <w:rFonts w:ascii="Arial" w:hAnsi="Arial" w:cs="Arial"/>
+          <w:sz w:val="20"/>
+          <w:szCs w:val="24"/>
+        </w:rPr>
+        <w:t xml:space="preserve">    </w:t>
+      </w:r>
+      <w:proofErr w:type="gramStart"/>
+      <w:r>
+        <w:rPr>
+          <w:rFonts w:ascii="Arial" w:hAnsi="Arial" w:cs="Arial"/>
+          <w:sz w:val="20"/>
+          <w:szCs w:val="24"/>
+        </w:rPr>
+        <w:t>constructor(</w:t>
+      </w:r>
+      <w:proofErr w:type="gramEnd"/>
+      <w:r>
+        <w:rPr>
+          <w:rFonts w:ascii="Arial" w:hAnsi="Arial" w:cs="Arial"/>
+          <w:sz w:val="20"/>
+          <w:szCs w:val="24"/>
+        </w:rPr>
+        <w:t>name: string, age: number) {</w:t>
+      </w:r>
+    </w:p>
+    <w:p>
+      <w:pPr>
+        <w:spacing w:after="0"/>
+        <w:rPr>
+          <w:rFonts w:ascii="Arial" w:hAnsi="Arial" w:cs="Arial"/>
+          <w:sz w:val="20"/>
+          <w:szCs w:val="24"/>
+        </w:rPr>
+      </w:pPr>
+      <w:r>
+        <w:rPr>
+          <w:rFonts w:ascii="Arial" w:hAnsi="Arial" w:cs="Arial"/>
+          <w:sz w:val="20"/>
+          <w:szCs w:val="24"/>
+        </w:rPr>
+        <w:t xml:space="preserve">        this.name = name;</w:t>
+      </w:r>
+    </w:p>
+    <w:p>
+      <w:pPr>
+        <w:spacing w:after="0"/>
+        <w:rPr>
+          <w:rFonts w:ascii="Arial" w:hAnsi="Arial" w:cs="Arial"/>
+          <w:sz w:val="20"/>
+          <w:szCs w:val="24"/>
+        </w:rPr>
+      </w:pPr>
+      <w:r>
+        <w:rPr>
+          <w:rFonts w:ascii="Arial" w:hAnsi="Arial" w:cs="Arial"/>
+          <w:sz w:val="20"/>
+          <w:szCs w:val="24"/>
+        </w:rPr>
+        <w:t xml:space="preserve">        </w:t>
+      </w:r>
+      <w:proofErr w:type="spellStart"/>
+      <w:r>
+        <w:rPr>
+          <w:rFonts w:ascii="Arial" w:hAnsi="Arial" w:cs="Arial"/>
+          <w:sz w:val="20"/>
+          <w:szCs w:val="24"/>
+        </w:rPr>
+        <w:t>this.age</w:t>
+      </w:r>
+      <w:proofErr w:type="spellEnd"/>
+      <w:r>
+        <w:rPr>
+          <w:rFonts w:ascii="Arial" w:hAnsi="Arial" w:cs="Arial"/>
+          <w:sz w:val="20"/>
+          <w:szCs w:val="24"/>
+        </w:rPr>
+        <w:t xml:space="preserve"> = age;</w:t>
+      </w:r>
+    </w:p>
+    <w:p>
+      <w:pPr>
+        <w:spacing w:after="0"/>
+        <w:rPr>
+          <w:rFonts w:ascii="Arial" w:hAnsi="Arial" w:cs="Arial"/>
+          <w:sz w:val="20"/>
+          <w:szCs w:val="24"/>
+        </w:rPr>
+      </w:pPr>
+      <w:r>
+        <w:rPr>
+          <w:rFonts w:ascii="Arial" w:hAnsi="Arial" w:cs="Arial"/>
+          <w:sz w:val="20"/>
+          <w:szCs w:val="24"/>
+        </w:rPr>
+        <w:t xml:space="preserve">    }</w:t>
+      </w:r>
+    </w:p>
+    <w:p>
+      <w:pPr>
+        <w:spacing w:after="0"/>
+        <w:rPr>
+          <w:rFonts w:ascii="Arial" w:hAnsi="Arial" w:cs="Arial"/>
+          <w:sz w:val="20"/>
+          <w:szCs w:val="24"/>
+        </w:rPr>
+      </w:pPr>
+      <w:r>
+        <w:rPr>
+          <w:rFonts w:ascii="Arial" w:hAnsi="Arial" w:cs="Arial"/>
+          <w:sz w:val="20"/>
+          <w:szCs w:val="24"/>
+        </w:rPr>
+        <w:t>}</w:t>
+      </w:r>
+    </w:p>
+    <w:p>
+      <w:pPr>
+        <w:spacing w:after="0"/>
+        <w:rPr>
+          <w:rFonts w:ascii="Arial" w:hAnsi="Arial" w:cs="Arial"/>
+          <w:sz w:val="20"/>
+          <w:szCs w:val="24"/>
+        </w:rPr>
+      </w:pPr>
+    </w:p>
+    <w:p>
+      <w:pPr>
+        <w:spacing w:after="0"/>
+        <w:rPr>
+          <w:sz w:val="26"/>
+        </w:rPr>
+      </w:pPr>
+      <w:r>
+        <w:rPr>
+          <w:rFonts w:ascii="Arial" w:eastAsia="Times New Roman" w:hAnsi="Arial" w:cs="Arial"/>
+          <w:b/>
+          <w:color w:val="1F1F1F"/>
+          <w:sz w:val="28"/>
+          <w:szCs w:val="24"/>
+        </w:rPr>
+        <w:t>(</w:t>
+      </w:r>
+      <w:r>
+        <w:rPr>
+          <w:rFonts w:ascii="Arial" w:eastAsia="Times New Roman" w:hAnsi="Arial" w:cs="Arial"/>
+          <w:b/>
+          <w:color w:val="1F1F1F"/>
+          <w:sz w:val="28"/>
+          <w:szCs w:val="24"/>
+        </w:rPr>
+        <w:t>c</w:t>
+      </w:r>
+      <w:r>
+        <w:rPr>
+          <w:rFonts w:ascii="Arial" w:eastAsia="Times New Roman" w:hAnsi="Arial" w:cs="Arial"/>
+          <w:b/>
+          <w:color w:val="1F1F1F"/>
+          <w:sz w:val="28"/>
+          <w:szCs w:val="24"/>
+        </w:rPr>
+        <w:t>)</w:t>
+      </w:r>
+      <w:r>
+        <w:rPr>
+          <w:rFonts w:ascii="Arial" w:eastAsia="Times New Roman" w:hAnsi="Arial" w:cs="Arial"/>
+          <w:color w:val="1F1F1F"/>
+          <w:sz w:val="28"/>
+          <w:szCs w:val="24"/>
+        </w:rPr>
+        <w:t>:</w:t>
+      </w:r>
+      <w:r>
+        <w:rPr>
+          <w:sz w:val="26"/>
+        </w:rPr>
+        <w:t xml:space="preserve"> </w:t>
+      </w:r>
+      <w:r>
+        <w:rPr>
+          <w:sz w:val="28"/>
+          <w:szCs w:val="24"/>
+        </w:rPr>
+        <w:t>Provide getter and setter methods.</w:t>
+      </w:r>
+      <w:r>
+        <w:rPr>
+          <w:sz w:val="26"/>
+        </w:rPr>
+        <w:t xml:space="preserve"> </w:t>
+      </w:r>
+    </w:p>
+    <w:p>
+      <w:pPr>
+        <w:spacing w:after="0"/>
+        <w:rPr>
+          <w:sz w:val="26"/>
+        </w:rPr>
+      </w:pPr>
+    </w:p>
+    <w:p>
+      <w:pPr>
+        <w:spacing w:after="0"/>
+        <w:rPr>
+          <w:rFonts w:ascii="Arial" w:hAnsi="Arial" w:cs="Arial"/>
+          <w:sz w:val="20"/>
+          <w:szCs w:val="24"/>
+        </w:rPr>
+      </w:pPr>
+      <w:proofErr w:type="gramStart"/>
+      <w:r>
+        <w:rPr>
+          <w:rFonts w:ascii="Arial" w:hAnsi="Arial" w:cs="Arial"/>
+          <w:sz w:val="20"/>
+          <w:szCs w:val="24"/>
+        </w:rPr>
+        <w:t>class</w:t>
+      </w:r>
+      <w:proofErr w:type="gramEnd"/>
+      <w:r>
+        <w:rPr>
+          <w:rFonts w:ascii="Arial" w:hAnsi="Arial" w:cs="Arial"/>
+          <w:sz w:val="20"/>
+          <w:szCs w:val="24"/>
+        </w:rPr>
+        <w:t xml:space="preserve"> Person {</w:t>
+      </w:r>
+    </w:p>
+    <w:p>
+      <w:pPr>
+        <w:spacing w:after="0"/>
+        <w:rPr>
+          <w:rFonts w:ascii="Arial" w:hAnsi="Arial" w:cs="Arial"/>
+          <w:sz w:val="20"/>
+          <w:szCs w:val="24"/>
+        </w:rPr>
+      </w:pPr>
+      <w:r>
+        <w:rPr>
+          <w:rFonts w:ascii="Arial" w:hAnsi="Arial" w:cs="Arial"/>
+          <w:sz w:val="20"/>
+          <w:szCs w:val="24"/>
+        </w:rPr>
+        <w:t xml:space="preserve">    </w:t>
+      </w:r>
+      <w:proofErr w:type="gramStart"/>
+      <w:r>
+        <w:rPr>
+          <w:rFonts w:ascii="Arial" w:hAnsi="Arial" w:cs="Arial"/>
+          <w:sz w:val="20"/>
+          <w:szCs w:val="24"/>
+        </w:rPr>
+        <w:t>private</w:t>
+      </w:r>
+      <w:proofErr w:type="gramEnd"/>
+      <w:r>
+        <w:rPr>
+          <w:rFonts w:ascii="Arial" w:hAnsi="Arial" w:cs="Arial"/>
+          <w:sz w:val="20"/>
+          <w:szCs w:val="24"/>
+        </w:rPr>
+        <w:t xml:space="preserve"> _name: string;</w:t>
+      </w:r>
+    </w:p>
+    <w:p>
+      <w:pPr>
+        <w:spacing w:after="0"/>
+        <w:rPr>
+          <w:rFonts w:ascii="Arial" w:hAnsi="Arial" w:cs="Arial"/>
+          <w:sz w:val="20"/>
+          <w:szCs w:val="24"/>
+        </w:rPr>
+      </w:pPr>
+      <w:r>
+        <w:rPr>
+          <w:rFonts w:ascii="Arial" w:hAnsi="Arial" w:cs="Arial"/>
+          <w:sz w:val="20"/>
+          <w:szCs w:val="24"/>
+        </w:rPr>
+        <w:t xml:space="preserve">    </w:t>
+      </w:r>
+      <w:proofErr w:type="gramStart"/>
+      <w:r>
+        <w:rPr>
+          <w:rFonts w:ascii="Arial" w:hAnsi="Arial" w:cs="Arial"/>
+          <w:sz w:val="20"/>
+          <w:szCs w:val="24"/>
+        </w:rPr>
+        <w:t>private</w:t>
+      </w:r>
+      <w:proofErr w:type="gramEnd"/>
+      <w:r>
+        <w:rPr>
+          <w:rFonts w:ascii="Arial" w:hAnsi="Arial" w:cs="Arial"/>
+          <w:sz w:val="20"/>
+          <w:szCs w:val="24"/>
+        </w:rPr>
+        <w:t xml:space="preserve"> _age: number;</w:t>
+      </w:r>
+    </w:p>
+    <w:p>
+      <w:pPr>
+        <w:spacing w:after="0"/>
+        <w:rPr>
+          <w:rFonts w:ascii="Arial" w:hAnsi="Arial" w:cs="Arial"/>
+          <w:sz w:val="20"/>
+          <w:szCs w:val="24"/>
+        </w:rPr>
+      </w:pPr>
+    </w:p>
+    <w:p>
+      <w:pPr>
+        <w:spacing w:after="0"/>
+        <w:rPr>
+          <w:rFonts w:ascii="Arial" w:hAnsi="Arial" w:cs="Arial"/>
+          <w:sz w:val="20"/>
+          <w:szCs w:val="24"/>
+        </w:rPr>
+      </w:pPr>
+      <w:r>
+        <w:rPr>
+          <w:rFonts w:ascii="Arial" w:hAnsi="Arial" w:cs="Arial"/>
+          <w:sz w:val="20"/>
+          <w:szCs w:val="24"/>
+        </w:rPr>
+        <w:t xml:space="preserve">    </w:t>
+      </w:r>
+      <w:proofErr w:type="gramStart"/>
+      <w:r>
+        <w:rPr>
+          <w:rFonts w:ascii="Arial" w:hAnsi="Arial" w:cs="Arial"/>
+          <w:sz w:val="20"/>
+          <w:szCs w:val="24"/>
+        </w:rPr>
+        <w:t>constructor(</w:t>
+      </w:r>
+      <w:proofErr w:type="gramEnd"/>
+      <w:r>
+        <w:rPr>
+          <w:rFonts w:ascii="Arial" w:hAnsi="Arial" w:cs="Arial"/>
+          <w:sz w:val="20"/>
+          <w:szCs w:val="24"/>
+        </w:rPr>
+        <w:t>name: string, age: number) {</w:t>
+      </w:r>
+    </w:p>
+    <w:p>
+      <w:pPr>
+        <w:spacing w:after="0"/>
+        <w:rPr>
+          <w:rFonts w:ascii="Arial" w:hAnsi="Arial" w:cs="Arial"/>
+          <w:sz w:val="20"/>
+          <w:szCs w:val="24"/>
+        </w:rPr>
+      </w:pPr>
+      <w:r>
+        <w:rPr>
+          <w:rFonts w:ascii="Arial" w:hAnsi="Arial" w:cs="Arial"/>
+          <w:sz w:val="20"/>
+          <w:szCs w:val="24"/>
+        </w:rPr>
+        <w:t xml:space="preserve">        </w:t>
+      </w:r>
+      <w:proofErr w:type="spellStart"/>
+      <w:r>
+        <w:rPr>
+          <w:rFonts w:ascii="Arial" w:hAnsi="Arial" w:cs="Arial"/>
+          <w:sz w:val="20"/>
+          <w:szCs w:val="24"/>
+        </w:rPr>
+        <w:t>this._name</w:t>
+      </w:r>
+      <w:proofErr w:type="spellEnd"/>
+      <w:r>
+        <w:rPr>
+          <w:rFonts w:ascii="Arial" w:hAnsi="Arial" w:cs="Arial"/>
+          <w:sz w:val="20"/>
+          <w:szCs w:val="24"/>
+        </w:rPr>
+        <w:t xml:space="preserve"> = name;</w:t>
+      </w:r>
+    </w:p>
+    <w:p>
+      <w:pPr>
+        <w:spacing w:after="0"/>
+        <w:rPr>
+          <w:rFonts w:ascii="Arial" w:hAnsi="Arial" w:cs="Arial"/>
+          <w:sz w:val="20"/>
+          <w:szCs w:val="24"/>
+        </w:rPr>
+      </w:pPr>
+      <w:r>
+        <w:rPr>
+          <w:rFonts w:ascii="Arial" w:hAnsi="Arial" w:cs="Arial"/>
+          <w:sz w:val="20"/>
+          <w:szCs w:val="24"/>
+        </w:rPr>
+        <w:t xml:space="preserve">        </w:t>
+      </w:r>
+      <w:proofErr w:type="spellStart"/>
+      <w:r>
+        <w:rPr>
+          <w:rFonts w:ascii="Arial" w:hAnsi="Arial" w:cs="Arial"/>
+          <w:sz w:val="20"/>
+          <w:szCs w:val="24"/>
+        </w:rPr>
+        <w:t>this._age</w:t>
+      </w:r>
+      <w:proofErr w:type="spellEnd"/>
+      <w:r>
+        <w:rPr>
+          <w:rFonts w:ascii="Arial" w:hAnsi="Arial" w:cs="Arial"/>
+          <w:sz w:val="20"/>
+          <w:szCs w:val="24"/>
+        </w:rPr>
+        <w:t xml:space="preserve"> = age;</w:t>
+      </w:r>
+    </w:p>
+    <w:p>
+      <w:pPr>
+        <w:spacing w:after="0"/>
+        <w:rPr>
+          <w:rFonts w:ascii="Arial" w:hAnsi="Arial" w:cs="Arial"/>
+          <w:sz w:val="20"/>
+          <w:szCs w:val="24"/>
+        </w:rPr>
+      </w:pPr>
+      <w:r>
+        <w:rPr>
+          <w:rFonts w:ascii="Arial" w:hAnsi="Arial" w:cs="Arial"/>
+          <w:sz w:val="20"/>
+          <w:szCs w:val="24"/>
+        </w:rPr>
+        <w:t xml:space="preserve">    }</w:t>
+      </w:r>
+    </w:p>
+    <w:p>
+      <w:pPr>
+        <w:spacing w:after="0"/>
+        <w:rPr>
+          <w:rFonts w:ascii="Arial" w:hAnsi="Arial" w:cs="Arial"/>
+          <w:sz w:val="20"/>
+          <w:szCs w:val="24"/>
+        </w:rPr>
+      </w:pPr>
+    </w:p>
+    <w:p>
+      <w:pPr>
+        <w:spacing w:after="0"/>
+        <w:rPr>
+          <w:rFonts w:ascii="Arial" w:hAnsi="Arial" w:cs="Arial"/>
+          <w:sz w:val="20"/>
+          <w:szCs w:val="24"/>
+        </w:rPr>
+      </w:pPr>
+      <w:r>
+        <w:rPr>
+          <w:rFonts w:ascii="Arial" w:hAnsi="Arial" w:cs="Arial"/>
+          <w:sz w:val="20"/>
+          <w:szCs w:val="24"/>
+        </w:rPr>
+        <w:t xml:space="preserve">    </w:t>
+      </w:r>
+      <w:proofErr w:type="gramStart"/>
+      <w:r>
+        <w:rPr>
+          <w:rFonts w:ascii="Arial" w:hAnsi="Arial" w:cs="Arial"/>
+          <w:sz w:val="20"/>
+          <w:szCs w:val="24"/>
+        </w:rPr>
+        <w:t>get</w:t>
+      </w:r>
+      <w:proofErr w:type="gramEnd"/>
+      <w:r>
+        <w:rPr>
+          <w:rFonts w:ascii="Arial" w:hAnsi="Arial" w:cs="Arial"/>
+          <w:sz w:val="20"/>
+          <w:szCs w:val="24"/>
+        </w:rPr>
+        <w:t xml:space="preserve"> name(): string {</w:t>
+      </w:r>
+    </w:p>
+    <w:p>
+      <w:pPr>
+        <w:spacing w:after="0"/>
+        <w:rPr>
+          <w:rFonts w:ascii="Arial" w:hAnsi="Arial" w:cs="Arial"/>
+          <w:sz w:val="20"/>
+          <w:szCs w:val="24"/>
+        </w:rPr>
+      </w:pPr>
+      <w:r>
+        <w:rPr>
+          <w:rFonts w:ascii="Arial" w:hAnsi="Arial" w:cs="Arial"/>
+          <w:sz w:val="20"/>
+          <w:szCs w:val="24"/>
+        </w:rPr>
+        <w:t xml:space="preserve">        </w:t>
+      </w:r>
+      <w:proofErr w:type="gramStart"/>
+      <w:r>
+        <w:rPr>
+          <w:rFonts w:ascii="Arial" w:hAnsi="Arial" w:cs="Arial"/>
+          <w:sz w:val="20"/>
+          <w:szCs w:val="24"/>
+        </w:rPr>
+        <w:t>return</w:t>
+      </w:r>
+      <w:proofErr w:type="gramEnd"/>
+      <w:r>
+        <w:rPr>
+          <w:rFonts w:ascii="Arial" w:hAnsi="Arial" w:cs="Arial"/>
+          <w:sz w:val="20"/>
+          <w:szCs w:val="24"/>
+        </w:rPr>
+        <w:t xml:space="preserve"> </w:t>
+      </w:r>
+      <w:proofErr w:type="spellStart"/>
+      <w:r>
+        <w:rPr>
+          <w:rFonts w:ascii="Arial" w:hAnsi="Arial" w:cs="Arial"/>
+          <w:sz w:val="20"/>
+          <w:szCs w:val="24"/>
+        </w:rPr>
+        <w:t>this._name</w:t>
+      </w:r>
+      <w:proofErr w:type="spellEnd"/>
+      <w:r>
+        <w:rPr>
+          <w:rFonts w:ascii="Arial" w:hAnsi="Arial" w:cs="Arial"/>
+          <w:sz w:val="20"/>
+          <w:szCs w:val="24"/>
+        </w:rPr>
+        <w:t>;</w:t>
+      </w:r>
+    </w:p>
+    <w:p>
+      <w:pPr>
+        <w:spacing w:after="0"/>
+        <w:rPr>
+          <w:rFonts w:ascii="Arial" w:hAnsi="Arial" w:cs="Arial"/>
+          <w:sz w:val="20"/>
+          <w:szCs w:val="24"/>
+        </w:rPr>
+      </w:pPr>
+      <w:r>
+        <w:rPr>
+          <w:rFonts w:ascii="Arial" w:hAnsi="Arial" w:cs="Arial"/>
+          <w:sz w:val="20"/>
+          <w:szCs w:val="24"/>
+        </w:rPr>
+        <w:t xml:space="preserve">    }</w:t>
+      </w:r>
+    </w:p>
+    <w:p>
+      <w:pPr>
+        <w:spacing w:after="0"/>
+        <w:rPr>
+          <w:rFonts w:ascii="Arial" w:hAnsi="Arial" w:cs="Arial"/>
+          <w:sz w:val="20"/>
+          <w:szCs w:val="24"/>
+        </w:rPr>
+      </w:pPr>
+    </w:p>
+    <w:p>
+      <w:pPr>
+        <w:spacing w:after="0"/>
+        <w:rPr>
+          <w:rFonts w:ascii="Arial" w:hAnsi="Arial" w:cs="Arial"/>
+          <w:sz w:val="20"/>
+          <w:szCs w:val="24"/>
+        </w:rPr>
+      </w:pPr>
+      <w:r>
+        <w:rPr>
+          <w:rFonts w:ascii="Arial" w:hAnsi="Arial" w:cs="Arial"/>
+          <w:sz w:val="20"/>
+          <w:szCs w:val="24"/>
+        </w:rPr>
+        <w:t xml:space="preserve">    </w:t>
+      </w:r>
+      <w:proofErr w:type="gramStart"/>
+      <w:r>
+        <w:rPr>
+          <w:rFonts w:ascii="Arial" w:hAnsi="Arial" w:cs="Arial"/>
+          <w:sz w:val="20"/>
+          <w:szCs w:val="24"/>
+        </w:rPr>
+        <w:t>set</w:t>
+      </w:r>
+      <w:proofErr w:type="gramEnd"/>
+      <w:r>
+        <w:rPr>
+          <w:rFonts w:ascii="Arial" w:hAnsi="Arial" w:cs="Arial"/>
+          <w:sz w:val="20"/>
+          <w:szCs w:val="24"/>
+        </w:rPr>
+        <w:t xml:space="preserve"> name(value: string) {</w:t>
+      </w:r>
+    </w:p>
+    <w:p>
+      <w:pPr>
+        <w:spacing w:after="0"/>
+        <w:rPr>
+          <w:rFonts w:ascii="Arial" w:hAnsi="Arial" w:cs="Arial"/>
+          <w:sz w:val="20"/>
+          <w:szCs w:val="24"/>
+        </w:rPr>
+      </w:pPr>
+      <w:r>
+        <w:rPr>
+          <w:rFonts w:ascii="Arial" w:hAnsi="Arial" w:cs="Arial"/>
+          <w:sz w:val="20"/>
+          <w:szCs w:val="24"/>
+        </w:rPr>
+        <w:t xml:space="preserve">        </w:t>
+      </w:r>
+      <w:proofErr w:type="spellStart"/>
+      <w:r>
+        <w:rPr>
+          <w:rFonts w:ascii="Arial" w:hAnsi="Arial" w:cs="Arial"/>
+          <w:sz w:val="20"/>
+          <w:szCs w:val="24"/>
+        </w:rPr>
+        <w:t>this._name</w:t>
+      </w:r>
+      <w:proofErr w:type="spellEnd"/>
+      <w:r>
+        <w:rPr>
+          <w:rFonts w:ascii="Arial" w:hAnsi="Arial" w:cs="Arial"/>
+          <w:sz w:val="20"/>
+          <w:szCs w:val="24"/>
+        </w:rPr>
+        <w:t xml:space="preserve"> = value;</w:t>
+      </w:r>
+    </w:p>
+    <w:p>
+      <w:pPr>
+        <w:spacing w:after="0"/>
+        <w:rPr>
+          <w:rFonts w:ascii="Arial" w:hAnsi="Arial" w:cs="Arial"/>
+          <w:sz w:val="20"/>
+          <w:szCs w:val="24"/>
+        </w:rPr>
+      </w:pPr>
+      <w:r>
+        <w:rPr>
+          <w:rFonts w:ascii="Arial" w:hAnsi="Arial" w:cs="Arial"/>
+          <w:sz w:val="20"/>
+          <w:szCs w:val="24"/>
+        </w:rPr>
+        <w:t xml:space="preserve">    }</w:t>
+      </w:r>
+    </w:p>
+    <w:p>
+      <w:pPr>
+        <w:spacing w:after="0"/>
+        <w:rPr>
+          <w:rFonts w:ascii="Arial" w:hAnsi="Arial" w:cs="Arial"/>
+          <w:sz w:val="20"/>
+          <w:szCs w:val="24"/>
+        </w:rPr>
+      </w:pPr>
+    </w:p>
+    <w:p>
+      <w:pPr>
+        <w:spacing w:after="0"/>
+        <w:rPr>
+          <w:rFonts w:ascii="Arial" w:hAnsi="Arial" w:cs="Arial"/>
+          <w:sz w:val="20"/>
+          <w:szCs w:val="24"/>
+        </w:rPr>
+      </w:pPr>
+      <w:r>
+        <w:rPr>
+          <w:rFonts w:ascii="Arial" w:hAnsi="Arial" w:cs="Arial"/>
+          <w:sz w:val="20"/>
+          <w:szCs w:val="24"/>
+        </w:rPr>
+        <w:t xml:space="preserve">    </w:t>
+      </w:r>
+      <w:proofErr w:type="gramStart"/>
+      <w:r>
+        <w:rPr>
+          <w:rFonts w:ascii="Arial" w:hAnsi="Arial" w:cs="Arial"/>
+          <w:sz w:val="20"/>
+          <w:szCs w:val="24"/>
+        </w:rPr>
+        <w:t>get</w:t>
+      </w:r>
+      <w:proofErr w:type="gramEnd"/>
+      <w:r>
+        <w:rPr>
+          <w:rFonts w:ascii="Arial" w:hAnsi="Arial" w:cs="Arial"/>
+          <w:sz w:val="20"/>
+          <w:szCs w:val="24"/>
+        </w:rPr>
+        <w:t xml:space="preserve"> age(): number {</w:t>
+      </w:r>
+    </w:p>
+    <w:p>
+      <w:pPr>
+        <w:spacing w:after="0"/>
+        <w:rPr>
+          <w:rFonts w:ascii="Arial" w:hAnsi="Arial" w:cs="Arial"/>
+          <w:sz w:val="20"/>
+          <w:szCs w:val="24"/>
+        </w:rPr>
+      </w:pPr>
+      <w:r>
+        <w:rPr>
+          <w:rFonts w:ascii="Arial" w:hAnsi="Arial" w:cs="Arial"/>
+          <w:sz w:val="20"/>
+          <w:szCs w:val="24"/>
+        </w:rPr>
+        <w:t xml:space="preserve">        </w:t>
+      </w:r>
+      <w:proofErr w:type="gramStart"/>
+      <w:r>
+        <w:rPr>
+          <w:rFonts w:ascii="Arial" w:hAnsi="Arial" w:cs="Arial"/>
+          <w:sz w:val="20"/>
+          <w:szCs w:val="24"/>
+        </w:rPr>
+        <w:t>return</w:t>
+      </w:r>
+      <w:proofErr w:type="gramEnd"/>
+      <w:r>
+        <w:rPr>
+          <w:rFonts w:ascii="Arial" w:hAnsi="Arial" w:cs="Arial"/>
+          <w:sz w:val="20"/>
+          <w:szCs w:val="24"/>
+        </w:rPr>
+        <w:t xml:space="preserve"> </w:t>
+      </w:r>
+      <w:proofErr w:type="spellStart"/>
+      <w:r>
+        <w:rPr>
+          <w:rFonts w:ascii="Arial" w:hAnsi="Arial" w:cs="Arial"/>
+          <w:sz w:val="20"/>
+          <w:szCs w:val="24"/>
+        </w:rPr>
+        <w:t>this._age</w:t>
+      </w:r>
+      <w:proofErr w:type="spellEnd"/>
+      <w:r>
+        <w:rPr>
+          <w:rFonts w:ascii="Arial" w:hAnsi="Arial" w:cs="Arial"/>
+          <w:sz w:val="20"/>
+          <w:szCs w:val="24"/>
+        </w:rPr>
+        <w:t>;</w:t>
+      </w:r>
+    </w:p>
+    <w:p>
+      <w:pPr>
+        <w:spacing w:after="0"/>
+        <w:rPr>
+          <w:rFonts w:ascii="Arial" w:hAnsi="Arial" w:cs="Arial"/>
+          <w:sz w:val="20"/>
+          <w:szCs w:val="24"/>
+        </w:rPr>
+      </w:pPr>
+      <w:r>
+        <w:rPr>
+          <w:rFonts w:ascii="Arial" w:hAnsi="Arial" w:cs="Arial"/>
+          <w:sz w:val="20"/>
+          <w:szCs w:val="24"/>
+        </w:rPr>
+        <w:t xml:space="preserve">    }</w:t>
+      </w:r>
+    </w:p>
+    <w:p>
+      <w:pPr>
+        <w:spacing w:after="0"/>
+        <w:rPr>
+          <w:rFonts w:ascii="Arial" w:hAnsi="Arial" w:cs="Arial"/>
+          <w:sz w:val="20"/>
+          <w:szCs w:val="24"/>
+        </w:rPr>
+      </w:pPr>
+    </w:p>
+    <w:p>
+      <w:pPr>
+        <w:spacing w:after="0"/>
+        <w:rPr>
+          <w:rFonts w:ascii="Arial" w:hAnsi="Arial" w:cs="Arial"/>
+          <w:sz w:val="20"/>
+          <w:szCs w:val="24"/>
+        </w:rPr>
+      </w:pPr>
+      <w:r>
+        <w:rPr>
+          <w:rFonts w:ascii="Arial" w:hAnsi="Arial" w:cs="Arial"/>
+          <w:sz w:val="20"/>
+          <w:szCs w:val="24"/>
+        </w:rPr>
+        <w:lastRenderedPageBreak/>
+        <w:t xml:space="preserve">    </w:t>
+      </w:r>
+      <w:proofErr w:type="gramStart"/>
+      <w:r>
+        <w:rPr>
+          <w:rFonts w:ascii="Arial" w:hAnsi="Arial" w:cs="Arial"/>
+          <w:sz w:val="20"/>
+          <w:szCs w:val="24"/>
+        </w:rPr>
+        <w:t>set</w:t>
+      </w:r>
+      <w:proofErr w:type="gramEnd"/>
+      <w:r>
+        <w:rPr>
+          <w:rFonts w:ascii="Arial" w:hAnsi="Arial" w:cs="Arial"/>
+          <w:sz w:val="20"/>
+          <w:szCs w:val="24"/>
+        </w:rPr>
+        <w:t xml:space="preserve"> age(value: number) {</w:t>
+      </w:r>
+    </w:p>
+    <w:p>
+      <w:pPr>
+        <w:spacing w:after="0"/>
+        <w:rPr>
+          <w:rFonts w:ascii="Arial" w:hAnsi="Arial" w:cs="Arial"/>
+          <w:sz w:val="20"/>
+          <w:szCs w:val="24"/>
+        </w:rPr>
+      </w:pPr>
+      <w:r>
+        <w:rPr>
+          <w:rFonts w:ascii="Arial" w:hAnsi="Arial" w:cs="Arial"/>
+          <w:sz w:val="20"/>
+          <w:szCs w:val="24"/>
+        </w:rPr>
+        <w:t xml:space="preserve">        </w:t>
+      </w:r>
+      <w:proofErr w:type="gramStart"/>
+      <w:r>
+        <w:rPr>
+          <w:rFonts w:ascii="Arial" w:hAnsi="Arial" w:cs="Arial"/>
+          <w:sz w:val="20"/>
+          <w:szCs w:val="24"/>
+        </w:rPr>
+        <w:t>if(</w:t>
+      </w:r>
+      <w:proofErr w:type="gramEnd"/>
+      <w:r>
+        <w:rPr>
+          <w:rFonts w:ascii="Arial" w:hAnsi="Arial" w:cs="Arial"/>
+          <w:sz w:val="20"/>
+          <w:szCs w:val="24"/>
+        </w:rPr>
+        <w:t xml:space="preserve">value &gt; 0) </w:t>
+      </w:r>
+      <w:proofErr w:type="spellStart"/>
+      <w:r>
+        <w:rPr>
+          <w:rFonts w:ascii="Arial" w:hAnsi="Arial" w:cs="Arial"/>
+          <w:sz w:val="20"/>
+          <w:szCs w:val="24"/>
+        </w:rPr>
+        <w:t>this._age</w:t>
+      </w:r>
+      <w:proofErr w:type="spellEnd"/>
+      <w:r>
+        <w:rPr>
+          <w:rFonts w:ascii="Arial" w:hAnsi="Arial" w:cs="Arial"/>
+          <w:sz w:val="20"/>
+          <w:szCs w:val="24"/>
+        </w:rPr>
+        <w:t xml:space="preserve"> = value;</w:t>
+      </w:r>
+    </w:p>
+    <w:p>
+      <w:pPr>
+        <w:spacing w:after="0"/>
+        <w:rPr>
+          <w:rFonts w:ascii="Arial" w:hAnsi="Arial" w:cs="Arial"/>
+          <w:sz w:val="20"/>
+          <w:szCs w:val="24"/>
+        </w:rPr>
+      </w:pPr>
+      <w:r>
+        <w:rPr>
+          <w:rFonts w:ascii="Arial" w:hAnsi="Arial" w:cs="Arial"/>
+          <w:sz w:val="20"/>
+          <w:szCs w:val="24"/>
+        </w:rPr>
+        <w:t xml:space="preserve">    }</w:t>
+      </w:r>
+    </w:p>
+    <w:p>
+      <w:pPr>
+        <w:spacing w:after="0"/>
+        <w:rPr>
+          <w:rFonts w:ascii="Arial" w:hAnsi="Arial" w:cs="Arial"/>
+          <w:sz w:val="20"/>
+          <w:szCs w:val="24"/>
+        </w:rPr>
+      </w:pPr>
+      <w:r>
+        <w:rPr>
+          <w:rFonts w:ascii="Arial" w:hAnsi="Arial" w:cs="Arial"/>
+          <w:sz w:val="20"/>
+          <w:szCs w:val="24"/>
+        </w:rPr>
+        <w:t>}</w:t>
+      </w:r>
+    </w:p>
+    <w:p>
+      <w:pPr>
+        <w:spacing w:after="0"/>
+        <w:rPr>
+          <w:rFonts w:ascii="Arial" w:hAnsi="Arial" w:cs="Arial"/>
+          <w:sz w:val="20"/>
+          <w:szCs w:val="24"/>
+        </w:rPr>
+      </w:pPr>
+    </w:p>
+    <w:p>
+      <w:pPr>
+        <w:spacing w:after="0"/>
+        <w:rPr>
+          <w:sz w:val="26"/>
+          <w:szCs w:val="26"/>
+        </w:rPr>
+      </w:pPr>
+      <w:r>
+        <w:rPr>
+          <w:rFonts w:ascii="Arial" w:eastAsia="Times New Roman" w:hAnsi="Arial" w:cs="Arial"/>
+          <w:b/>
+          <w:color w:val="1F1F1F"/>
+          <w:sz w:val="28"/>
+          <w:szCs w:val="24"/>
+        </w:rPr>
+        <w:t>(</w:t>
+      </w:r>
+      <w:proofErr w:type="spellStart"/>
+      <w:proofErr w:type="gramStart"/>
+      <w:r>
+        <w:rPr>
+          <w:rFonts w:ascii="Arial" w:eastAsia="Times New Roman" w:hAnsi="Arial" w:cs="Arial"/>
+          <w:b/>
+          <w:color w:val="1F1F1F"/>
+          <w:sz w:val="28"/>
+          <w:szCs w:val="24"/>
+        </w:rPr>
+        <w:t>d&amp;</w:t>
+      </w:r>
+      <w:proofErr w:type="gramEnd"/>
+      <w:r>
+        <w:rPr>
+          <w:rFonts w:ascii="Arial" w:eastAsia="Times New Roman" w:hAnsi="Arial" w:cs="Arial"/>
+          <w:b/>
+          <w:color w:val="1F1F1F"/>
+          <w:sz w:val="28"/>
+          <w:szCs w:val="24"/>
+        </w:rPr>
+        <w:t>e</w:t>
+      </w:r>
+      <w:proofErr w:type="spellEnd"/>
+      <w:r>
+        <w:rPr>
+          <w:rFonts w:ascii="Arial" w:eastAsia="Times New Roman" w:hAnsi="Arial" w:cs="Arial"/>
+          <w:b/>
+          <w:color w:val="1F1F1F"/>
+          <w:sz w:val="28"/>
+          <w:szCs w:val="24"/>
+        </w:rPr>
+        <w:t>)</w:t>
+      </w:r>
+      <w:r>
+        <w:rPr>
+          <w:rFonts w:ascii="Arial" w:eastAsia="Times New Roman" w:hAnsi="Arial" w:cs="Arial"/>
+          <w:color w:val="1F1F1F"/>
+          <w:sz w:val="28"/>
+          <w:szCs w:val="24"/>
+        </w:rPr>
+        <w:t>:</w:t>
+      </w:r>
+      <w:r>
+        <w:rPr>
+          <w:sz w:val="26"/>
+          <w:szCs w:val="26"/>
+        </w:rPr>
+        <w:t xml:space="preserve"> </w:t>
+      </w:r>
+      <w:r>
+        <w:rPr>
+          <w:sz w:val="26"/>
+          <w:szCs w:val="26"/>
+        </w:rPr>
+        <w:t>Create a derived class Student that inherits from</w:t>
+      </w:r>
+      <w:r>
+        <w:rPr>
+          <w:sz w:val="26"/>
+          <w:szCs w:val="26"/>
+        </w:rPr>
+        <w:t xml:space="preserve"> </w:t>
+      </w:r>
+      <w:r>
+        <w:rPr>
+          <w:sz w:val="26"/>
+          <w:szCs w:val="26"/>
+        </w:rPr>
+        <w:t>Person.</w:t>
+      </w:r>
+      <w:r>
+        <w:rPr>
+          <w:sz w:val="26"/>
+          <w:szCs w:val="26"/>
+        </w:rPr>
+        <w:t xml:space="preserve"> </w:t>
+      </w:r>
+      <w:r>
+        <w:rPr>
+          <w:sz w:val="26"/>
+          <w:szCs w:val="26"/>
+        </w:rPr>
+        <w:t xml:space="preserve">Add attributes: </w:t>
+      </w:r>
+      <w:proofErr w:type="spellStart"/>
+      <w:r>
+        <w:rPr>
+          <w:sz w:val="26"/>
+          <w:szCs w:val="26"/>
+        </w:rPr>
+        <w:t>studentId</w:t>
+      </w:r>
+      <w:proofErr w:type="spellEnd"/>
+      <w:r>
+        <w:rPr>
+          <w:sz w:val="26"/>
+          <w:szCs w:val="26"/>
+        </w:rPr>
+        <w:t xml:space="preserve"> and department.</w:t>
+      </w:r>
+      <w:r>
+        <w:rPr>
+          <w:sz w:val="26"/>
+          <w:szCs w:val="26"/>
+        </w:rPr>
+        <w:t xml:space="preserve"> </w:t>
+      </w:r>
+    </w:p>
+    <w:p>
+      <w:pPr>
+        <w:spacing w:after="0"/>
+        <w:rPr>
+          <w:sz w:val="26"/>
+          <w:szCs w:val="26"/>
+        </w:rPr>
+      </w:pPr>
+    </w:p>
+    <w:p>
+      <w:pPr>
+        <w:spacing w:after="0"/>
+        <w:rPr>
+          <w:sz w:val="26"/>
+        </w:rPr>
+      </w:pPr>
+      <w:proofErr w:type="gramStart"/>
+      <w:r>
+        <w:rPr>
+          <w:sz w:val="26"/>
+        </w:rPr>
+        <w:t>class</w:t>
+      </w:r>
+      <w:proofErr w:type="gramEnd"/>
+      <w:r>
+        <w:rPr>
+          <w:sz w:val="26"/>
+        </w:rPr>
+        <w:t xml:space="preserve"> Student extends Person {</w:t>
+      </w:r>
+    </w:p>
+    <w:p>
+      <w:pPr>
+        <w:spacing w:after="0"/>
+        <w:rPr>
+          <w:sz w:val="26"/>
+        </w:rPr>
+      </w:pPr>
+      <w:r>
+        <w:rPr>
+          <w:sz w:val="26"/>
+        </w:rPr>
+        <w:t xml:space="preserve">    </w:t>
+      </w:r>
+      <w:proofErr w:type="spellStart"/>
+      <w:proofErr w:type="gramStart"/>
+      <w:r>
+        <w:rPr>
+          <w:sz w:val="26"/>
+        </w:rPr>
+        <w:t>studentId</w:t>
+      </w:r>
+      <w:proofErr w:type="spellEnd"/>
+      <w:proofErr w:type="gramEnd"/>
+      <w:r>
+        <w:rPr>
+          <w:sz w:val="26"/>
+        </w:rPr>
+        <w:t>: string;</w:t>
+      </w:r>
+    </w:p>
+    <w:p>
+      <w:pPr>
+        <w:spacing w:after="0"/>
+        <w:rPr>
+          <w:sz w:val="26"/>
+        </w:rPr>
+      </w:pPr>
+      <w:r>
+        <w:rPr>
+          <w:sz w:val="26"/>
+        </w:rPr>
+        <w:t xml:space="preserve">    </w:t>
+      </w:r>
+      <w:proofErr w:type="gramStart"/>
+      <w:r>
+        <w:rPr>
+          <w:sz w:val="26"/>
+        </w:rPr>
+        <w:t>department</w:t>
+      </w:r>
+      <w:proofErr w:type="gramEnd"/>
+      <w:r>
+        <w:rPr>
+          <w:sz w:val="26"/>
+        </w:rPr>
+        <w:t>: string;</w:t>
+      </w:r>
+    </w:p>
+    <w:p>
+      <w:pPr>
+        <w:spacing w:after="0"/>
+        <w:rPr>
+          <w:sz w:val="26"/>
+        </w:rPr>
+      </w:pPr>
+    </w:p>
+    <w:p>
+      <w:pPr>
+        <w:spacing w:after="0"/>
+        <w:rPr>
+          <w:sz w:val="26"/>
+        </w:rPr>
+      </w:pPr>
+      <w:r>
+        <w:rPr>
+          <w:sz w:val="26"/>
+        </w:rPr>
+        <w:t xml:space="preserve">    </w:t>
+      </w:r>
+      <w:proofErr w:type="gramStart"/>
+      <w:r>
+        <w:rPr>
+          <w:sz w:val="26"/>
+        </w:rPr>
+        <w:t>constructor(</w:t>
+      </w:r>
+      <w:proofErr w:type="gramEnd"/>
+      <w:r>
+        <w:rPr>
+          <w:sz w:val="26"/>
+        </w:rPr>
+        <w:t xml:space="preserve">name: string, age: number, id: string, </w:t>
+      </w:r>
+      <w:proofErr w:type="spellStart"/>
+      <w:r>
+        <w:rPr>
+          <w:sz w:val="26"/>
+        </w:rPr>
+        <w:t>dept</w:t>
+      </w:r>
+      <w:proofErr w:type="spellEnd"/>
+      <w:r>
+        <w:rPr>
+          <w:sz w:val="26"/>
+        </w:rPr>
+        <w:t>: string) {</w:t>
+      </w:r>
+    </w:p>
+    <w:p>
+      <w:pPr>
+        <w:spacing w:after="0"/>
+        <w:rPr>
+          <w:sz w:val="26"/>
+        </w:rPr>
+      </w:pPr>
+      <w:r>
+        <w:rPr>
+          <w:sz w:val="26"/>
+        </w:rPr>
+        <w:t xml:space="preserve">        </w:t>
+      </w:r>
+      <w:proofErr w:type="gramStart"/>
+      <w:r>
+        <w:rPr>
+          <w:sz w:val="26"/>
+        </w:rPr>
+        <w:t>super(</w:t>
+      </w:r>
+      <w:proofErr w:type="gramEnd"/>
+      <w:r>
+        <w:rPr>
+          <w:sz w:val="26"/>
+        </w:rPr>
+        <w:t>name,</w:t>
+      </w:r>
+      <w:r>
+        <w:rPr>
+          <w:sz w:val="26"/>
+        </w:rPr>
+        <w:t xml:space="preserve"> age); // Base (parent) class (Person)</w:t>
+      </w:r>
+      <w:r>
+        <w:rPr>
+          <w:sz w:val="26"/>
+        </w:rPr>
+        <w:t xml:space="preserve"> constructor call </w:t>
+      </w:r>
+    </w:p>
+    <w:p>
+      <w:pPr>
+        <w:spacing w:after="0"/>
+        <w:rPr>
+          <w:sz w:val="26"/>
+        </w:rPr>
+      </w:pPr>
+      <w:r>
+        <w:rPr>
+          <w:sz w:val="26"/>
+        </w:rPr>
+        <w:t xml:space="preserve">        </w:t>
+      </w:r>
+      <w:proofErr w:type="spellStart"/>
+      <w:r>
+        <w:rPr>
+          <w:sz w:val="26"/>
+        </w:rPr>
+        <w:t>this.studentId</w:t>
+      </w:r>
+      <w:proofErr w:type="spellEnd"/>
+      <w:r>
+        <w:rPr>
+          <w:sz w:val="26"/>
+        </w:rPr>
+        <w:t xml:space="preserve"> = id;</w:t>
+      </w:r>
+    </w:p>
+    <w:p>
+      <w:pPr>
+        <w:spacing w:after="0"/>
+        <w:rPr>
+          <w:sz w:val="26"/>
+        </w:rPr>
+      </w:pPr>
+      <w:r>
+        <w:rPr>
+          <w:sz w:val="26"/>
+        </w:rPr>
+        <w:t xml:space="preserve">        </w:t>
+      </w:r>
+      <w:proofErr w:type="spellStart"/>
+      <w:r>
+        <w:rPr>
+          <w:sz w:val="26"/>
+        </w:rPr>
+        <w:t>this.department</w:t>
+      </w:r>
+      <w:proofErr w:type="spellEnd"/>
+      <w:r>
+        <w:rPr>
+          <w:sz w:val="26"/>
+        </w:rPr>
+        <w:t xml:space="preserve"> = </w:t>
+      </w:r>
+      <w:proofErr w:type="spellStart"/>
+      <w:r>
+        <w:rPr>
+          <w:sz w:val="26"/>
+        </w:rPr>
+        <w:t>dept</w:t>
+      </w:r>
+      <w:proofErr w:type="spellEnd"/>
+      <w:r>
+        <w:rPr>
+          <w:sz w:val="26"/>
+        </w:rPr>
+        <w:t>;</w:t>
+      </w:r>
+    </w:p>
+    <w:p>
+      <w:pPr>
+        <w:spacing w:after="0"/>
+        <w:rPr>
+          <w:sz w:val="26"/>
+        </w:rPr>
+      </w:pPr>
+      <w:r>
+        <w:rPr>
+          <w:sz w:val="26"/>
+        </w:rPr>
+        <w:t xml:space="preserve">    }</w:t>
+      </w:r>
+    </w:p>
+    <w:p>
+      <w:pPr>
+        <w:spacing w:after="0"/>
+        <w:rPr>
+          <w:sz w:val="26"/>
+        </w:rPr>
+      </w:pPr>
+      <w:r>
+        <w:rPr>
+          <w:sz w:val="26"/>
+        </w:rPr>
+        <w:t>}</w:t>
+      </w:r>
+    </w:p>
+    <w:p>
+      <w:pPr>
+        <w:spacing w:after="0"/>
+        <w:rPr>
+          <w:sz w:val="26"/>
+        </w:rPr>
+      </w:pPr>
+    </w:p>
+    <w:p>
+      <w:pPr>
+        <w:spacing w:after="0"/>
+        <w:rPr>
+          <w:sz w:val="26"/>
+          <w:szCs w:val="26"/>
+        </w:rPr>
+      </w:pPr>
+      <w:r>
+        <w:rPr>
+          <w:rFonts w:ascii="Arial" w:eastAsia="Times New Roman" w:hAnsi="Arial" w:cs="Arial"/>
+          <w:b/>
+          <w:color w:val="1F1F1F"/>
+          <w:sz w:val="26"/>
+          <w:szCs w:val="26"/>
+        </w:rPr>
+        <w:t>f)</w:t>
+      </w:r>
+      <w:r>
+        <w:rPr>
+          <w:sz w:val="26"/>
+          <w:szCs w:val="26"/>
+        </w:rPr>
+        <w:t xml:space="preserve"> Create a class Course with attributes </w:t>
+      </w:r>
+      <w:proofErr w:type="spellStart"/>
+      <w:r>
+        <w:rPr>
+          <w:sz w:val="26"/>
+          <w:szCs w:val="26"/>
+        </w:rPr>
+        <w:t>courseCode</w:t>
+      </w:r>
+      <w:proofErr w:type="spellEnd"/>
+      <w:r>
+        <w:rPr>
+          <w:sz w:val="26"/>
+          <w:szCs w:val="26"/>
+        </w:rPr>
+        <w:t xml:space="preserve">, </w:t>
+      </w:r>
+      <w:proofErr w:type="spellStart"/>
+      <w:r>
+        <w:rPr>
+          <w:sz w:val="26"/>
+          <w:szCs w:val="26"/>
+        </w:rPr>
+        <w:t>courseName</w:t>
+      </w:r>
+      <w:proofErr w:type="spellEnd"/>
+      <w:r>
+        <w:rPr>
+          <w:sz w:val="26"/>
+          <w:szCs w:val="26"/>
+        </w:rPr>
+        <w:t xml:space="preserve">, and </w:t>
+      </w:r>
+      <w:proofErr w:type="spellStart"/>
+      <w:r>
+        <w:rPr>
+          <w:sz w:val="26"/>
+          <w:szCs w:val="26"/>
+        </w:rPr>
+        <w:t>creditHours</w:t>
+      </w:r>
+      <w:proofErr w:type="spellEnd"/>
+      <w:r>
+        <w:rPr>
+          <w:sz w:val="26"/>
+          <w:szCs w:val="26"/>
+        </w:rPr>
+        <w:t>.</w:t>
+      </w:r>
+    </w:p>
+    <w:p>
+      <w:pPr>
+        <w:spacing w:after="0"/>
+        <w:rPr>
+          <w:sz w:val="26"/>
+          <w:szCs w:val="26"/>
+        </w:rPr>
+      </w:pPr>
+      <w:proofErr w:type="gramStart"/>
+      <w:r>
+        <w:rPr>
+          <w:sz w:val="26"/>
+          <w:szCs w:val="26"/>
+        </w:rPr>
+        <w:t>class</w:t>
+      </w:r>
+      <w:proofErr w:type="gramEnd"/>
+      <w:r>
+        <w:rPr>
+          <w:sz w:val="26"/>
+          <w:szCs w:val="26"/>
+        </w:rPr>
+        <w:t xml:space="preserve"> Course {</w:t>
+      </w:r>
+    </w:p>
+    <w:p>
+      <w:pPr>
+        <w:spacing w:after="0"/>
+        <w:rPr>
+          <w:sz w:val="26"/>
+          <w:szCs w:val="26"/>
+        </w:rPr>
+      </w:pPr>
+      <w:r>
+        <w:rPr>
+          <w:sz w:val="26"/>
+          <w:szCs w:val="26"/>
+        </w:rPr>
+        <w:t xml:space="preserve">    </w:t>
+      </w:r>
+      <w:proofErr w:type="spellStart"/>
+      <w:proofErr w:type="gramStart"/>
+      <w:r>
+        <w:rPr>
+          <w:sz w:val="26"/>
+          <w:szCs w:val="26"/>
+        </w:rPr>
+        <w:t>courseCode</w:t>
+      </w:r>
+      <w:proofErr w:type="spellEnd"/>
+      <w:proofErr w:type="gramEnd"/>
+      <w:r>
+        <w:rPr>
+          <w:sz w:val="26"/>
+          <w:szCs w:val="26"/>
+        </w:rPr>
+        <w:t>: string;</w:t>
+      </w:r>
+    </w:p>
+    <w:p>
+      <w:pPr>
+        <w:spacing w:after="0"/>
+        <w:rPr>
+          <w:sz w:val="26"/>
+          <w:szCs w:val="26"/>
+        </w:rPr>
+      </w:pPr>
+      <w:r>
+        <w:rPr>
+          <w:sz w:val="26"/>
+          <w:szCs w:val="26"/>
+        </w:rPr>
+        <w:t xml:space="preserve">    </w:t>
+      </w:r>
+      <w:proofErr w:type="spellStart"/>
+      <w:proofErr w:type="gramStart"/>
+      <w:r>
+        <w:rPr>
+          <w:sz w:val="26"/>
+          <w:szCs w:val="26"/>
+        </w:rPr>
+        <w:t>courseName</w:t>
+      </w:r>
+      <w:proofErr w:type="spellEnd"/>
+      <w:proofErr w:type="gramEnd"/>
+      <w:r>
+        <w:rPr>
+          <w:sz w:val="26"/>
+          <w:szCs w:val="26"/>
+        </w:rPr>
+        <w:t>: string;</w:t>
+      </w:r>
+    </w:p>
+    <w:p>
+      <w:pPr>
+        <w:spacing w:after="0"/>
+        <w:rPr>
+          <w:sz w:val="26"/>
+          <w:szCs w:val="26"/>
+        </w:rPr>
+      </w:pPr>
+      <w:r>
+        <w:rPr>
+          <w:sz w:val="26"/>
+          <w:szCs w:val="26"/>
+        </w:rPr>
+        <w:t xml:space="preserve">    </w:t>
+      </w:r>
+      <w:proofErr w:type="spellStart"/>
+      <w:proofErr w:type="gramStart"/>
+      <w:r>
+        <w:rPr>
+          <w:sz w:val="26"/>
+          <w:szCs w:val="26"/>
+        </w:rPr>
+        <w:t>creditHours</w:t>
+      </w:r>
+      <w:proofErr w:type="spellEnd"/>
+      <w:proofErr w:type="gramEnd"/>
+      <w:r>
+        <w:rPr>
+          <w:sz w:val="26"/>
+          <w:szCs w:val="26"/>
+        </w:rPr>
+        <w:t>: number;</w:t>
+      </w:r>
+    </w:p>
+    <w:p>
+      <w:pPr>
+        <w:spacing w:after="0"/>
+        <w:rPr>
+          <w:sz w:val="26"/>
+          <w:szCs w:val="26"/>
+        </w:rPr>
+      </w:pPr>
+    </w:p>
+    <w:p>
+      <w:pPr>
+        <w:spacing w:after="0"/>
+        <w:rPr>
+          <w:sz w:val="26"/>
+          <w:szCs w:val="26"/>
+        </w:rPr>
+      </w:pPr>
+      <w:r>
+        <w:rPr>
+          <w:sz w:val="26"/>
+          <w:szCs w:val="26"/>
+        </w:rPr>
+        <w:t xml:space="preserve">    </w:t>
+      </w:r>
+      <w:proofErr w:type="gramStart"/>
+      <w:r>
+        <w:rPr>
+          <w:sz w:val="26"/>
+          <w:szCs w:val="26"/>
+        </w:rPr>
+        <w:t>constructor(</w:t>
+      </w:r>
+      <w:proofErr w:type="gramEnd"/>
+      <w:r>
+        <w:rPr>
+          <w:sz w:val="26"/>
+          <w:szCs w:val="26"/>
+        </w:rPr>
+        <w:t>code: string, name: string, hours: number) {</w:t>
+      </w:r>
+    </w:p>
+    <w:p>
+      <w:pPr>
+        <w:spacing w:after="0"/>
+        <w:rPr>
+          <w:sz w:val="26"/>
+          <w:szCs w:val="26"/>
+        </w:rPr>
+      </w:pPr>
+      <w:r>
+        <w:rPr>
+          <w:sz w:val="26"/>
+          <w:szCs w:val="26"/>
+        </w:rPr>
+        <w:t xml:space="preserve">        </w:t>
+      </w:r>
+      <w:proofErr w:type="spellStart"/>
+      <w:r>
+        <w:rPr>
+          <w:sz w:val="26"/>
+          <w:szCs w:val="26"/>
+        </w:rPr>
+        <w:t>this.courseCode</w:t>
+      </w:r>
+      <w:proofErr w:type="spellEnd"/>
+      <w:r>
+        <w:rPr>
+          <w:sz w:val="26"/>
+          <w:szCs w:val="26"/>
+        </w:rPr>
+        <w:t xml:space="preserve"> = code;</w:t>
+      </w:r>
+    </w:p>
+    <w:p>
+      <w:pPr>
+        <w:spacing w:after="0"/>
+        <w:rPr>
+          <w:sz w:val="26"/>
+          <w:szCs w:val="26"/>
+        </w:rPr>
+      </w:pPr>
+      <w:r>
+        <w:rPr>
+          <w:sz w:val="26"/>
+          <w:szCs w:val="26"/>
+        </w:rPr>
+        <w:t xml:space="preserve">        </w:t>
+      </w:r>
+      <w:proofErr w:type="spellStart"/>
+      <w:r>
+        <w:rPr>
+          <w:sz w:val="26"/>
+          <w:szCs w:val="26"/>
+        </w:rPr>
+        <w:t>this.courseName</w:t>
+      </w:r>
+      <w:proofErr w:type="spellEnd"/>
+      <w:r>
+        <w:rPr>
+          <w:sz w:val="26"/>
+          <w:szCs w:val="26"/>
+        </w:rPr>
+        <w:t xml:space="preserve"> = name;</w:t>
+      </w:r>
+    </w:p>
+    <w:p>
+      <w:pPr>
+        <w:spacing w:after="0"/>
+        <w:rPr>
+          <w:sz w:val="26"/>
+          <w:szCs w:val="26"/>
+        </w:rPr>
+      </w:pPr>
+      <w:r>
+        <w:rPr>
+          <w:sz w:val="26"/>
+          <w:szCs w:val="26"/>
+        </w:rPr>
+        <w:t xml:space="preserve">        </w:t>
+      </w:r>
+      <w:proofErr w:type="spellStart"/>
+      <w:r>
+        <w:rPr>
+          <w:sz w:val="26"/>
+          <w:szCs w:val="26"/>
+        </w:rPr>
+        <w:t>this.creditHours</w:t>
+      </w:r>
+      <w:proofErr w:type="spellEnd"/>
+      <w:r>
+        <w:rPr>
+          <w:sz w:val="26"/>
+          <w:szCs w:val="26"/>
+        </w:rPr>
+        <w:t xml:space="preserve"> = hours;</w:t>
+      </w:r>
+    </w:p>
+    <w:p>
+      <w:pPr>
+        <w:spacing w:after="0"/>
+        <w:rPr>
+          <w:sz w:val="26"/>
+          <w:szCs w:val="26"/>
+        </w:rPr>
+      </w:pPr>
+      <w:r>
+        <w:rPr>
+          <w:sz w:val="26"/>
+          <w:szCs w:val="26"/>
+        </w:rPr>
+        <w:t xml:space="preserve">    }</w:t>
+      </w:r>
+    </w:p>
+    <w:p>
+      <w:pPr>
+        <w:spacing w:after="0"/>
+        <w:rPr>
+          <w:sz w:val="26"/>
+          <w:szCs w:val="26"/>
+        </w:rPr>
+      </w:pPr>
+      <w:r>
+        <w:rPr>
+          <w:sz w:val="26"/>
+          <w:szCs w:val="26"/>
+        </w:rPr>
+        <w:t>}</w:t>
+      </w:r>
+    </w:p>
+    <w:p>
+      <w:pPr>
+        <w:spacing w:after="0"/>
+        <w:rPr>
+          <w:sz w:val="26"/>
+          <w:szCs w:val="26"/>
+        </w:rPr>
+      </w:pPr>
+      <w:r>
+        <w:rPr>
+          <w:rFonts w:ascii="Arial" w:eastAsia="Times New Roman" w:hAnsi="Arial" w:cs="Arial"/>
+          <w:b/>
+          <w:color w:val="1F1F1F"/>
+          <w:sz w:val="26"/>
+          <w:szCs w:val="26"/>
+        </w:rPr>
+        <w:t>g)</w:t>
+      </w:r>
+      <w:r>
+        <w:rPr>
+          <w:sz w:val="26"/>
+          <w:szCs w:val="26"/>
+        </w:rPr>
+        <w:t xml:space="preserve"> Apply encapsulation using private attributes and public methods. </w:t>
+      </w:r>
+    </w:p>
+    <w:p>
+      <w:pPr>
+        <w:spacing w:after="0"/>
+        <w:rPr>
+          <w:sz w:val="26"/>
+          <w:szCs w:val="26"/>
+        </w:rPr>
+      </w:pPr>
+      <w:proofErr w:type="gramStart"/>
+      <w:r>
+        <w:rPr>
+          <w:sz w:val="26"/>
+          <w:szCs w:val="26"/>
+        </w:rPr>
+        <w:t>class</w:t>
+      </w:r>
+      <w:proofErr w:type="gramEnd"/>
+      <w:r>
+        <w:rPr>
+          <w:sz w:val="26"/>
+          <w:szCs w:val="26"/>
+        </w:rPr>
+        <w:t xml:space="preserve"> Course {</w:t>
+      </w:r>
+    </w:p>
+    <w:p>
+      <w:pPr>
+        <w:spacing w:after="0"/>
+        <w:rPr>
+          <w:sz w:val="26"/>
+          <w:szCs w:val="26"/>
+        </w:rPr>
+      </w:pPr>
+      <w:r>
+        <w:rPr>
+          <w:sz w:val="26"/>
+          <w:szCs w:val="26"/>
+        </w:rPr>
+        <w:t xml:space="preserve">    </w:t>
+      </w:r>
+      <w:proofErr w:type="gramStart"/>
+      <w:r>
+        <w:rPr>
+          <w:sz w:val="26"/>
+          <w:szCs w:val="26"/>
+        </w:rPr>
+        <w:t>private</w:t>
+      </w:r>
+      <w:proofErr w:type="gramEnd"/>
+      <w:r>
+        <w:rPr>
+          <w:sz w:val="26"/>
+          <w:szCs w:val="26"/>
+        </w:rPr>
+        <w:t xml:space="preserve"> _</w:t>
+      </w:r>
+      <w:proofErr w:type="spellStart"/>
+      <w:r>
+        <w:rPr>
+          <w:sz w:val="26"/>
+          <w:szCs w:val="26"/>
+        </w:rPr>
+        <w:t>courseName</w:t>
+      </w:r>
+      <w:proofErr w:type="spellEnd"/>
+      <w:r>
+        <w:rPr>
+          <w:sz w:val="26"/>
+          <w:szCs w:val="26"/>
+        </w:rPr>
+        <w:t>: string;</w:t>
+      </w:r>
+    </w:p>
+    <w:p>
+      <w:pPr>
+        <w:spacing w:after="0"/>
+        <w:rPr>
+          <w:sz w:val="26"/>
+          <w:szCs w:val="26"/>
+        </w:rPr>
+      </w:pPr>
+    </w:p>
+    <w:p>
+      <w:pPr>
+        <w:spacing w:after="0"/>
+        <w:rPr>
+          <w:sz w:val="26"/>
+          <w:szCs w:val="26"/>
+        </w:rPr>
+      </w:pPr>
+      <w:r>
+        <w:rPr>
+          <w:sz w:val="26"/>
+          <w:szCs w:val="26"/>
+        </w:rPr>
+        <w:t xml:space="preserve">    </w:t>
+      </w:r>
+      <w:proofErr w:type="gramStart"/>
+      <w:r>
+        <w:rPr>
+          <w:sz w:val="26"/>
+          <w:szCs w:val="26"/>
+        </w:rPr>
+        <w:t>constructor(</w:t>
+      </w:r>
+      <w:proofErr w:type="gramEnd"/>
+      <w:r>
+        <w:rPr>
+          <w:sz w:val="26"/>
+          <w:szCs w:val="26"/>
+        </w:rPr>
+        <w:t>name: string) {</w:t>
+      </w:r>
+    </w:p>
+    <w:p>
+      <w:pPr>
+        <w:spacing w:after="0"/>
+        <w:rPr>
+          <w:sz w:val="26"/>
+          <w:szCs w:val="26"/>
+        </w:rPr>
+      </w:pPr>
+      <w:r>
+        <w:rPr>
+          <w:sz w:val="26"/>
+          <w:szCs w:val="26"/>
+        </w:rPr>
+        <w:t xml:space="preserve">        this._</w:t>
+      </w:r>
+      <w:proofErr w:type="spellStart"/>
+      <w:r>
+        <w:rPr>
+          <w:sz w:val="26"/>
+          <w:szCs w:val="26"/>
+        </w:rPr>
+        <w:t>courseName</w:t>
+      </w:r>
+      <w:proofErr w:type="spellEnd"/>
+      <w:r>
+        <w:rPr>
+          <w:sz w:val="26"/>
+          <w:szCs w:val="26"/>
+        </w:rPr>
+        <w:t xml:space="preserve"> = name;</w:t>
+      </w:r>
+    </w:p>
+    <w:p>
+      <w:pPr>
+        <w:spacing w:after="0"/>
+        <w:rPr>
+          <w:sz w:val="26"/>
+          <w:szCs w:val="26"/>
+        </w:rPr>
+      </w:pPr>
+      <w:r>
+        <w:rPr>
+          <w:sz w:val="26"/>
+          <w:szCs w:val="26"/>
+        </w:rPr>
+        <w:t xml:space="preserve">    }</w:t>
+      </w:r>
+    </w:p>
+    <w:p>
+      <w:pPr>
+        <w:spacing w:after="0"/>
+        <w:rPr>
+          <w:sz w:val="26"/>
+          <w:szCs w:val="26"/>
+        </w:rPr>
+      </w:pPr>
+    </w:p>
+    <w:p>
+      <w:pPr>
+        <w:spacing w:after="0"/>
+        <w:rPr>
+          <w:sz w:val="26"/>
+          <w:szCs w:val="26"/>
+        </w:rPr>
+      </w:pPr>
+      <w:r>
+        <w:rPr>
+          <w:sz w:val="26"/>
+          <w:szCs w:val="26"/>
+        </w:rPr>
+        <w:lastRenderedPageBreak/>
+        <w:t xml:space="preserve">    </w:t>
+      </w:r>
+      <w:proofErr w:type="gramStart"/>
+      <w:r>
+        <w:rPr>
+          <w:sz w:val="26"/>
+          <w:szCs w:val="26"/>
+        </w:rPr>
+        <w:t>public</w:t>
+      </w:r>
+      <w:proofErr w:type="gramEnd"/>
+      <w:r>
+        <w:rPr>
+          <w:sz w:val="26"/>
+          <w:szCs w:val="26"/>
+        </w:rPr>
+        <w:t xml:space="preserve"> </w:t>
+      </w:r>
+      <w:proofErr w:type="spellStart"/>
+      <w:r>
+        <w:rPr>
+          <w:sz w:val="26"/>
+          <w:szCs w:val="26"/>
+        </w:rPr>
+        <w:t>getCourseName</w:t>
+      </w:r>
+      <w:proofErr w:type="spellEnd"/>
+      <w:r>
+        <w:rPr>
+          <w:sz w:val="26"/>
+          <w:szCs w:val="26"/>
+        </w:rPr>
+        <w:t>(): string {</w:t>
+      </w:r>
+    </w:p>
+    <w:p>
+      <w:pPr>
+        <w:spacing w:after="0"/>
+        <w:rPr>
+          <w:sz w:val="26"/>
+          <w:szCs w:val="26"/>
+        </w:rPr>
+      </w:pPr>
+      <w:r>
+        <w:rPr>
+          <w:sz w:val="26"/>
+          <w:szCs w:val="26"/>
+        </w:rPr>
+        <w:t xml:space="preserve">        </w:t>
+      </w:r>
+      <w:proofErr w:type="gramStart"/>
+      <w:r>
+        <w:rPr>
+          <w:sz w:val="26"/>
+          <w:szCs w:val="26"/>
+        </w:rPr>
+        <w:t>return</w:t>
+      </w:r>
+      <w:proofErr w:type="gramEnd"/>
+      <w:r>
+        <w:rPr>
+          <w:sz w:val="26"/>
+          <w:szCs w:val="26"/>
+        </w:rPr>
+        <w:t xml:space="preserve"> this._</w:t>
+      </w:r>
+      <w:proofErr w:type="spellStart"/>
+      <w:r>
+        <w:rPr>
+          <w:sz w:val="26"/>
+          <w:szCs w:val="26"/>
+        </w:rPr>
+        <w:t>courseName</w:t>
+      </w:r>
+      <w:proofErr w:type="spellEnd"/>
+      <w:r>
+        <w:rPr>
+          <w:sz w:val="26"/>
+          <w:szCs w:val="26"/>
+        </w:rPr>
+        <w:t>;</w:t>
+      </w:r>
+    </w:p>
+    <w:p>
+      <w:pPr>
+        <w:spacing w:after="0"/>
+        <w:rPr>
+          <w:sz w:val="26"/>
+          <w:szCs w:val="26"/>
+        </w:rPr>
+      </w:pPr>
+      <w:r>
+        <w:rPr>
+          <w:sz w:val="26"/>
+          <w:szCs w:val="26"/>
+        </w:rPr>
+        <w:t xml:space="preserve">    }</w:t>
+      </w:r>
+    </w:p>
+    <w:p>
+      <w:pPr>
+        <w:spacing w:after="0"/>
+        <w:rPr>
+          <w:sz w:val="26"/>
+          <w:szCs w:val="26"/>
+        </w:rPr>
+      </w:pPr>
+    </w:p>
+    <w:p>
+      <w:pPr>
+        <w:spacing w:after="0"/>
+        <w:rPr>
+          <w:sz w:val="26"/>
+          <w:szCs w:val="26"/>
+        </w:rPr>
+      </w:pPr>
+      <w:r>
+        <w:rPr>
+          <w:sz w:val="26"/>
+          <w:szCs w:val="26"/>
+        </w:rPr>
+        <w:t xml:space="preserve">    </w:t>
+      </w:r>
+      <w:proofErr w:type="gramStart"/>
+      <w:r>
+        <w:rPr>
+          <w:sz w:val="26"/>
+          <w:szCs w:val="26"/>
+        </w:rPr>
+        <w:t>public</w:t>
+      </w:r>
+      <w:proofErr w:type="gramEnd"/>
+      <w:r>
+        <w:rPr>
+          <w:sz w:val="26"/>
+          <w:szCs w:val="26"/>
+        </w:rPr>
+        <w:t xml:space="preserve"> </w:t>
+      </w:r>
+      <w:proofErr w:type="spellStart"/>
+      <w:r>
+        <w:rPr>
+          <w:sz w:val="26"/>
+          <w:szCs w:val="26"/>
+        </w:rPr>
+        <w:t>setCourseName</w:t>
+      </w:r>
+      <w:proofErr w:type="spellEnd"/>
+      <w:r>
+        <w:rPr>
+          <w:sz w:val="26"/>
+          <w:szCs w:val="26"/>
+        </w:rPr>
+        <w:t>(name: string): void {</w:t>
+      </w:r>
+    </w:p>
+    <w:p>
+      <w:pPr>
+        <w:spacing w:after="0"/>
+        <w:rPr>
+          <w:sz w:val="26"/>
+          <w:szCs w:val="26"/>
+        </w:rPr>
+      </w:pPr>
+      <w:r>
+        <w:rPr>
+          <w:sz w:val="26"/>
+          <w:szCs w:val="26"/>
+        </w:rPr>
+        <w:t xml:space="preserve">        this._</w:t>
+      </w:r>
+      <w:proofErr w:type="spellStart"/>
+      <w:r>
+        <w:rPr>
+          <w:sz w:val="26"/>
+          <w:szCs w:val="26"/>
+        </w:rPr>
+        <w:t>courseName</w:t>
+      </w:r>
+      <w:proofErr w:type="spellEnd"/>
+      <w:r>
+        <w:rPr>
+          <w:sz w:val="26"/>
+          <w:szCs w:val="26"/>
+        </w:rPr>
+        <w:t xml:space="preserve"> = name;</w:t>
+      </w:r>
+    </w:p>
+    <w:p>
+      <w:pPr>
+        <w:spacing w:after="0"/>
+        <w:rPr>
+          <w:sz w:val="26"/>
+          <w:szCs w:val="26"/>
+        </w:rPr>
+      </w:pPr>
+      <w:r>
+        <w:rPr>
+          <w:sz w:val="26"/>
+          <w:szCs w:val="26"/>
+        </w:rPr>
+        <w:t xml:space="preserve">    }</w:t>
+      </w:r>
+    </w:p>
+    <w:p>
+      <w:pPr>
+        <w:spacing w:after="0"/>
+        <w:rPr>
+          <w:sz w:val="26"/>
+          <w:szCs w:val="26"/>
+        </w:rPr>
+      </w:pPr>
+      <w:r>
+        <w:rPr>
+          <w:sz w:val="26"/>
+          <w:szCs w:val="26"/>
+        </w:rPr>
+        <w:t>}</w:t>
+      </w:r>
+    </w:p>
+    <w:p>
+      <w:pPr>
+        <w:spacing w:after="0"/>
+        <w:rPr>
+          <w:sz w:val="26"/>
+          <w:szCs w:val="26"/>
+        </w:rPr>
+      </w:pPr>
+      <w:r>
+        <w:rPr>
+          <w:rFonts w:ascii="Arial" w:eastAsia="Times New Roman" w:hAnsi="Arial" w:cs="Arial"/>
+          <w:b/>
+          <w:color w:val="1F1F1F"/>
+          <w:sz w:val="26"/>
+          <w:szCs w:val="26"/>
+        </w:rPr>
+        <w:t>h)</w:t>
+      </w:r>
+      <w:r>
+        <w:rPr>
+          <w:sz w:val="26"/>
+          <w:szCs w:val="26"/>
+        </w:rPr>
+        <w:t xml:space="preserve"> Demonstrate abstraction by creating an abstract class Evaluation with an abstract method </w:t>
+      </w:r>
+      <w:proofErr w:type="spellStart"/>
+      <w:proofErr w:type="gramStart"/>
+      <w:r>
+        <w:rPr>
+          <w:sz w:val="26"/>
+          <w:szCs w:val="26"/>
+        </w:rPr>
+        <w:t>calculateGrade</w:t>
+      </w:r>
+      <w:proofErr w:type="spellEnd"/>
+      <w:r>
+        <w:rPr>
+          <w:sz w:val="26"/>
+          <w:szCs w:val="26"/>
+        </w:rPr>
+        <w:t>(</w:t>
+      </w:r>
+      <w:proofErr w:type="gramEnd"/>
+      <w:r>
+        <w:rPr>
+          <w:sz w:val="26"/>
+          <w:szCs w:val="26"/>
+        </w:rPr>
+        <w:t xml:space="preserve">). </w:t>
+      </w:r>
+    </w:p>
+    <w:p>
+      <w:pPr>
+        <w:spacing w:after="0"/>
+        <w:rPr>
+          <w:rFonts w:ascii="Arial" w:hAnsi="Arial" w:cs="Arial"/>
+          <w:sz w:val="26"/>
+          <w:szCs w:val="26"/>
+        </w:rPr>
+      </w:pPr>
+      <w:proofErr w:type="spellStart"/>
+      <w:r>
+        <w:rPr>
+          <w:rFonts w:ascii="Arial" w:eastAsia="Times New Roman" w:hAnsi="Arial" w:cs="Arial"/>
+          <w:b/>
+          <w:color w:val="1F1F1F"/>
+          <w:sz w:val="26"/>
+          <w:szCs w:val="26"/>
+        </w:rPr>
+        <w:t>i</w:t>
+      </w:r>
+      <w:proofErr w:type="spellEnd"/>
+      <w:r>
+        <w:rPr>
+          <w:rFonts w:ascii="Arial" w:eastAsia="Times New Roman" w:hAnsi="Arial" w:cs="Arial"/>
+          <w:b/>
+          <w:color w:val="1F1F1F"/>
+          <w:sz w:val="26"/>
+          <w:szCs w:val="26"/>
+        </w:rPr>
+        <w:t>)</w:t>
+      </w:r>
+      <w:r>
+        <w:rPr>
+          <w:sz w:val="26"/>
+          <w:szCs w:val="26"/>
+        </w:rPr>
+        <w:t xml:space="preserve"> Implement this in a subclass </w:t>
+      </w:r>
+      <w:proofErr w:type="spellStart"/>
+      <w:r>
+        <w:rPr>
+          <w:sz w:val="26"/>
+          <w:szCs w:val="26"/>
+        </w:rPr>
+        <w:t>ExamEvaluation</w:t>
+      </w:r>
+      <w:proofErr w:type="spellEnd"/>
+      <w:r>
+        <w:rPr>
+          <w:sz w:val="26"/>
+          <w:szCs w:val="26"/>
+        </w:rPr>
+        <w:t>.</w:t>
+      </w:r>
+      <w:bookmarkStart w:id="0" w:name="_GoBack"/>
+      <w:bookmarkEnd w:id="0"/>
     </w:p>
     <w:sectPr>
       <w:pgSz w:w="12240" w:h="15840"/>
-      <w:pgMar w:top="720" w:right="720" w:bottom="720" w:left="720" w:header="720" w:footer="720" w:gutter="0"/>
+      <w:pgMar w:top="1440" w:right="1440" w:bottom="1440" w:left="1440" w:header="720" w:footer="720" w:gutter="0"/>
       <w:cols w:space="720"/>
       <w:docGrid w:linePitch="360"/>
     </w:sectPr>

</xml_diff>